<commit_message>
docs(revisao): documentos regerados, textos ineditos e rascunho de misturas
- PS/ED/AE/EX regerados a partir do codigo atual (versoes revisadas pelo
  Agnaldo ficam no historico do git).
- NV-Textos-Ineditos.docx: 276 textos que ele ainda nao viu na forma
  atual (nunca extraidos antes ou alterados depois da revisao), com
  manifesto proprio para reimportar (scripts/gerar_revisao_ineditos.js).
- Rascunho ED-0576 (misturas proibidas), conferido na Anvisa 24/09/2026
  e no Washington State DOH, em .md e .docx.
- Planos de importacao de PS, ED e EX guardados como registro.

Co-Authored-By: Claude Opus 5.5 <noreply@anthropic.com>
</commit_message>
<xml_diff>
--- a/docs/revisao-conteudo/AE-Atividades-Eventuais.docx
+++ b/docs/revisao-conteudo/AE-Atividades-Eventuais.docx
@@ -176,7 +176,7 @@
           <w:sz w:val="20"/>
           <w:szCs w:val="20"/>
         </w:rPr>
-        <w:t xml:space="preserve">222 textos neste documento.</w:t>
+        <w:t xml:space="preserve">238 textos neste documento.</w:t>
       </w:r>
     </w:p>
     <w:p>
@@ -251,7 +251,7 @@
           <w:sz w:val="26"/>
           <w:szCs w:val="26"/>
         </w:rPr>
-        <w:t xml:space="preserve">Na Estrada</w:t>
+        <w:t xml:space="preserve">Férias e Viagem</w:t>
       </w:r>
     </w:p>
     <w:p>
@@ -272,7 +272,7 @@
           <w:sz w:val="22"/>
           <w:szCs w:val="22"/>
         </w:rPr>
-        <w:t xml:space="preserve">Use cadeirinha adequada ao peso/idade. Faça paradas a cada 2h. Nunca deixe objetos soltos no carro: viram projéteis em freadas e podem agravar a situação em caso de acidentes, além de ser passível de infração de trânsito. Utilize as travas manuais das portas traseiras (trava de criança).</w:t>
+        <w:t xml:space="preserve">Relaxamento sem acidentes</w:t>
       </w:r>
     </w:p>
     <w:p>
@@ -287,7 +287,7 @@
           <w:sz w:val="26"/>
           <w:szCs w:val="26"/>
         </w:rPr>
-        <w:t xml:space="preserve">Praia e Piscina</w:t>
+        <w:t xml:space="preserve">Na Estrada</w:t>
       </w:r>
     </w:p>
     <w:p>
@@ -308,7 +308,7 @@
           <w:sz w:val="22"/>
           <w:szCs w:val="22"/>
         </w:rPr>
-        <w:t xml:space="preserve">Acesse o Guia de Afogamentos na seção de Riscos Físicos para conhecer as regras de supervisão e o uso correto de coletes. Cuidado com exposição excessiva ao sol (filtro a cada 2h).</w:t>
+        <w:t xml:space="preserve">Use cadeirinha adequada ao peso/idade. Faça paradas a cada 2h. Nunca deixe objetos soltos no carro: viram projéteis em freadas e podem agravar a situação em caso de acidentes, além de ser passível de infração de trânsito. Utilize as travas manuais das portas traseiras (trava de criança).</w:t>
       </w:r>
     </w:p>
     <w:p>
@@ -323,7 +323,7 @@
           <w:sz w:val="26"/>
           <w:szCs w:val="26"/>
         </w:rPr>
-        <w:t xml:space="preserve">Hotel e Pousada</w:t>
+        <w:t xml:space="preserve">Praia e Piscina</w:t>
       </w:r>
     </w:p>
     <w:p>
@@ -344,7 +344,7 @@
           <w:sz w:val="22"/>
           <w:szCs w:val="22"/>
         </w:rPr>
-        <w:t xml:space="preserve">Verifique sacadas e janelas assim que chegar. Afaste móveis que sirvam de "escada" para janelas. Cuidado com tomadas desconhecidas e acesso à área da piscina.</w:t>
+        <w:t xml:space="preserve">Acesse o Guia de Afogamentos na seção de Riscos Físicos para conhecer as regras de supervisão e o uso correto de coletes. Cuidado com exposição excessiva ao sol (filtro a cada 2h).</w:t>
       </w:r>
     </w:p>
     <w:p>
@@ -359,7 +359,7 @@
           <w:sz w:val="26"/>
           <w:szCs w:val="26"/>
         </w:rPr>
-        <w:t xml:space="preserve">Criança Perdida</w:t>
+        <w:t xml:space="preserve">Hotel e Pousada</w:t>
       </w:r>
     </w:p>
     <w:p>
@@ -380,7 +380,7 @@
           <w:sz w:val="22"/>
           <w:szCs w:val="22"/>
         </w:rPr>
-        <w:t xml:space="preserve">Em locais lotados, use pulseira de identificação com nome e telefone. Tire uma foto da criança com a roupa do dia antes de sair. Marque um ponto de encontro. Se a criança já interage oriente-a para caso ela se perca.</w:t>
+        <w:t xml:space="preserve">Verifique sacadas e janelas assim que chegar. Afaste móveis que sirvam de "escada" para janelas. Cuidado com tomadas desconhecidas e acesso à área da piscina.</w:t>
       </w:r>
     </w:p>
     <w:p>
@@ -395,6 +395,42 @@
           <w:sz w:val="26"/>
           <w:szCs w:val="26"/>
         </w:rPr>
+        <w:t xml:space="preserve">Criança Perdida</w:t>
+      </w:r>
+    </w:p>
+    <w:p>
+      <w:pPr>
+        <w:spacing w:after="160" w:line="300"/>
+      </w:pPr>
+      <w:r>
+        <w:rPr>
+          <w:rFonts w:ascii="Consolas" w:cs="Consolas" w:eastAsia="Consolas" w:hAnsi="Consolas"/>
+          <w:color w:val="9AA0A6"/>
+          <w:sz w:val="14"/>
+          <w:szCs w:val="14"/>
+        </w:rPr>
+        <w:t xml:space="preserve">AE-0005  </w:t>
+      </w:r>
+      <w:r>
+        <w:rPr>
+          <w:sz w:val="22"/>
+          <w:szCs w:val="22"/>
+        </w:rPr>
+        <w:t xml:space="preserve">Em locais lotados, use pulseira de identificação com nome e telefone. Tire uma foto da criança com a roupa do dia antes de sair. Marque um ponto de encontro. Se a criança já interage oriente-a para caso ela se perca.</w:t>
+      </w:r>
+    </w:p>
+    <w:p>
+      <w:pPr>
+        <w:pStyle w:val="Heading2"/>
+        <w:spacing w:after="120" w:before="280"/>
+      </w:pPr>
+      <w:r>
+        <w:rPr>
+          <w:b/>
+          <w:bCs/>
+          <w:sz w:val="26"/>
+          <w:szCs w:val="26"/>
+        </w:rPr>
         <w:t xml:space="preserve">Kit Viagem</w:t>
       </w:r>
     </w:p>
@@ -409,7 +445,7 @@
           <w:sz w:val="14"/>
           <w:szCs w:val="14"/>
         </w:rPr>
-        <w:t xml:space="preserve">AE-0005  </w:t>
+        <w:t xml:space="preserve">AE-0006  </w:t>
       </w:r>
       <w:r>
         <w:rPr>
@@ -448,28 +484,28 @@
           <w:sz w:val="26"/>
           <w:szCs w:val="26"/>
         </w:rPr>
-        <w:t xml:space="preserve">Mochila e Postura</w:t>
-      </w:r>
-    </w:p>
-    <w:p>
-      <w:pPr>
-        <w:spacing w:after="160" w:line="300"/>
-      </w:pPr>
-      <w:r>
-        <w:rPr>
-          <w:rFonts w:ascii="Consolas" w:cs="Consolas" w:eastAsia="Consolas" w:hAnsi="Consolas"/>
-          <w:color w:val="9AA0A6"/>
-          <w:sz w:val="14"/>
-          <w:szCs w:val="14"/>
-        </w:rPr>
-        <w:t xml:space="preserve">AE-0006  </w:t>
-      </w:r>
-      <w:r>
-        <w:rPr>
-          <w:sz w:val="22"/>
-          <w:szCs w:val="22"/>
-        </w:rPr>
-        <w:t xml:space="preserve">O peso da mochila não deve exceder 10% do peso da criança. Dê preferência a mochilas de rodinhas ou com alças largas e acolchoadas. Ajuste para ficar rente às costas, nunca caída.</w:t>
+        <w:t xml:space="preserve">Escola Segura</w:t>
+      </w:r>
+    </w:p>
+    <w:p>
+      <w:pPr>
+        <w:spacing w:after="160" w:line="300"/>
+      </w:pPr>
+      <w:r>
+        <w:rPr>
+          <w:rFonts w:ascii="Consolas" w:cs="Consolas" w:eastAsia="Consolas" w:hAnsi="Consolas"/>
+          <w:color w:val="9AA0A6"/>
+          <w:sz w:val="14"/>
+          <w:szCs w:val="14"/>
+        </w:rPr>
+        <w:t xml:space="preserve">AE-0007  </w:t>
+      </w:r>
+      <w:r>
+        <w:rPr>
+          <w:sz w:val="22"/>
+          <w:szCs w:val="22"/>
+        </w:rPr>
+        <w:t xml:space="preserve">Proteção dentro e fora da sala de aula</w:t>
       </w:r>
     </w:p>
     <w:p>
@@ -484,28 +520,28 @@
           <w:sz w:val="26"/>
           <w:szCs w:val="26"/>
         </w:rPr>
-        <w:t xml:space="preserve">Transporte Escolar</w:t>
-      </w:r>
-    </w:p>
-    <w:p>
-      <w:pPr>
-        <w:spacing w:after="160" w:line="300"/>
-      </w:pPr>
-      <w:r>
-        <w:rPr>
-          <w:rFonts w:ascii="Consolas" w:cs="Consolas" w:eastAsia="Consolas" w:hAnsi="Consolas"/>
-          <w:color w:val="9AA0A6"/>
-          <w:sz w:val="14"/>
-          <w:szCs w:val="14"/>
-        </w:rPr>
-        <w:t xml:space="preserve">AE-0007  </w:t>
-      </w:r>
-      <w:r>
-        <w:rPr>
-          <w:sz w:val="22"/>
-          <w:szCs w:val="22"/>
-        </w:rPr>
-        <w:t xml:space="preserve">Ensine a criança a esperar o ônibus na calçada, nunca na rua. Dentro da van ou carro, o cinto de segurança é obrigatório o tempo todo. Oriente a criança para nunca colocar cabeça ou braços para fora.</w:t>
+        <w:t xml:space="preserve">Mochila e Postura</w:t>
+      </w:r>
+    </w:p>
+    <w:p>
+      <w:pPr>
+        <w:spacing w:after="160" w:line="300"/>
+      </w:pPr>
+      <w:r>
+        <w:rPr>
+          <w:rFonts w:ascii="Consolas" w:cs="Consolas" w:eastAsia="Consolas" w:hAnsi="Consolas"/>
+          <w:color w:val="9AA0A6"/>
+          <w:sz w:val="14"/>
+          <w:szCs w:val="14"/>
+        </w:rPr>
+        <w:t xml:space="preserve">AE-0008  </w:t>
+      </w:r>
+      <w:r>
+        <w:rPr>
+          <w:sz w:val="22"/>
+          <w:szCs w:val="22"/>
+        </w:rPr>
+        <w:t xml:space="preserve">O peso da mochila não deve exceder 10% do peso da criança. Dê preferência a mochilas de rodinhas ou com alças largas e acolchoadas. Ajuste para ficar rente às costas, nunca caída.</w:t>
       </w:r>
     </w:p>
     <w:p>
@@ -520,28 +556,28 @@
           <w:sz w:val="26"/>
           <w:szCs w:val="26"/>
         </w:rPr>
-        <w:t xml:space="preserve">Bullying e Cyberbullying</w:t>
-      </w:r>
-    </w:p>
-    <w:p>
-      <w:pPr>
-        <w:spacing w:after="160" w:line="300"/>
-      </w:pPr>
-      <w:r>
-        <w:rPr>
-          <w:rFonts w:ascii="Consolas" w:cs="Consolas" w:eastAsia="Consolas" w:hAnsi="Consolas"/>
-          <w:color w:val="9AA0A6"/>
-          <w:sz w:val="14"/>
-          <w:szCs w:val="14"/>
-        </w:rPr>
-        <w:t xml:space="preserve">AE-0008  </w:t>
-      </w:r>
-      <w:r>
-        <w:rPr>
-          <w:sz w:val="22"/>
-          <w:szCs w:val="22"/>
-        </w:rPr>
-        <w:t xml:space="preserve">Fique atento a mudanças de comportamento, queda no rendimento ou recusa em ir à escola. Mantenha diálogo aberto. No digital, monitore o uso de redes sociais e jogos.</w:t>
+        <w:t xml:space="preserve">Transporte Escolar</w:t>
+      </w:r>
+    </w:p>
+    <w:p>
+      <w:pPr>
+        <w:spacing w:after="160" w:line="300"/>
+      </w:pPr>
+      <w:r>
+        <w:rPr>
+          <w:rFonts w:ascii="Consolas" w:cs="Consolas" w:eastAsia="Consolas" w:hAnsi="Consolas"/>
+          <w:color w:val="9AA0A6"/>
+          <w:sz w:val="14"/>
+          <w:szCs w:val="14"/>
+        </w:rPr>
+        <w:t xml:space="preserve">AE-0009  </w:t>
+      </w:r>
+      <w:r>
+        <w:rPr>
+          <w:sz w:val="22"/>
+          <w:szCs w:val="22"/>
+        </w:rPr>
+        <w:t xml:space="preserve">Ensine a criança a esperar o ônibus na calçada, nunca na rua. Dentro da van ou carro, o cinto de segurança é obrigatório o tempo todo. Oriente a criança para nunca colocar cabeça ou braços para fora.</w:t>
       </w:r>
     </w:p>
     <w:p>
@@ -556,28 +592,28 @@
           <w:sz w:val="26"/>
           <w:szCs w:val="26"/>
         </w:rPr>
-        <w:t xml:space="preserve">Emergências na Escola</w:t>
-      </w:r>
-    </w:p>
-    <w:p>
-      <w:pPr>
-        <w:spacing w:after="160" w:line="300"/>
-      </w:pPr>
-      <w:r>
-        <w:rPr>
-          <w:rFonts w:ascii="Consolas" w:cs="Consolas" w:eastAsia="Consolas" w:hAnsi="Consolas"/>
-          <w:color w:val="9AA0A6"/>
-          <w:sz w:val="14"/>
-          <w:szCs w:val="14"/>
-        </w:rPr>
-        <w:t xml:space="preserve">AE-0009  </w:t>
-      </w:r>
-      <w:r>
-        <w:rPr>
-          <w:sz w:val="22"/>
-          <w:szCs w:val="22"/>
-        </w:rPr>
-        <w:t xml:space="preserve">A criança deve saber o nome completo dos pais e um telefone de contato. Atualize sempre a ficha médica da escola com alergias e medicamentos.</w:t>
+        <w:t xml:space="preserve">Bullying e Cyberbullying</w:t>
+      </w:r>
+    </w:p>
+    <w:p>
+      <w:pPr>
+        <w:spacing w:after="160" w:line="300"/>
+      </w:pPr>
+      <w:r>
+        <w:rPr>
+          <w:rFonts w:ascii="Consolas" w:cs="Consolas" w:eastAsia="Consolas" w:hAnsi="Consolas"/>
+          <w:color w:val="9AA0A6"/>
+          <w:sz w:val="14"/>
+          <w:szCs w:val="14"/>
+        </w:rPr>
+        <w:t xml:space="preserve">AE-0010  </w:t>
+      </w:r>
+      <w:r>
+        <w:rPr>
+          <w:sz w:val="22"/>
+          <w:szCs w:val="22"/>
+        </w:rPr>
+        <w:t xml:space="preserve">Fique atento a mudanças de comportamento, queda no rendimento ou recusa em ir à escola. Mantenha diálogo aberto. No digital, monitore o uso de redes sociais e jogos.</w:t>
       </w:r>
     </w:p>
     <w:p>
@@ -592,6 +628,42 @@
           <w:sz w:val="26"/>
           <w:szCs w:val="26"/>
         </w:rPr>
+        <w:t xml:space="preserve">Emergências na Escola</w:t>
+      </w:r>
+    </w:p>
+    <w:p>
+      <w:pPr>
+        <w:spacing w:after="160" w:line="300"/>
+      </w:pPr>
+      <w:r>
+        <w:rPr>
+          <w:rFonts w:ascii="Consolas" w:cs="Consolas" w:eastAsia="Consolas" w:hAnsi="Consolas"/>
+          <w:color w:val="9AA0A6"/>
+          <w:sz w:val="14"/>
+          <w:szCs w:val="14"/>
+        </w:rPr>
+        <w:t xml:space="preserve">AE-0011  </w:t>
+      </w:r>
+      <w:r>
+        <w:rPr>
+          <w:sz w:val="22"/>
+          <w:szCs w:val="22"/>
+        </w:rPr>
+        <w:t xml:space="preserve">A criança deve saber o nome completo dos pais e um telefone de contato. Atualize sempre a ficha médica da escola com alergias e medicamentos.</w:t>
+      </w:r>
+    </w:p>
+    <w:p>
+      <w:pPr>
+        <w:pStyle w:val="Heading2"/>
+        <w:spacing w:after="120" w:before="280"/>
+      </w:pPr>
+      <w:r>
+        <w:rPr>
+          <w:b/>
+          <w:bCs/>
+          <w:sz w:val="26"/>
+          <w:szCs w:val="26"/>
+        </w:rPr>
         <w:t xml:space="preserve">Lanche Seguro</w:t>
       </w:r>
     </w:p>
@@ -606,7 +678,7 @@
           <w:sz w:val="14"/>
           <w:szCs w:val="14"/>
         </w:rPr>
-        <w:t xml:space="preserve">AE-0010  </w:t>
+        <w:t xml:space="preserve">AE-0012  </w:t>
       </w:r>
       <w:r>
         <w:rPr>
@@ -645,28 +717,28 @@
           <w:sz w:val="26"/>
           <w:szCs w:val="26"/>
         </w:rPr>
-        <w:t xml:space="preserve">Prevenção de Quedas</w:t>
-      </w:r>
-    </w:p>
-    <w:p>
-      <w:pPr>
-        <w:spacing w:after="160" w:line="300"/>
-      </w:pPr>
-      <w:r>
-        <w:rPr>
-          <w:rFonts w:ascii="Consolas" w:cs="Consolas" w:eastAsia="Consolas" w:hAnsi="Consolas"/>
-          <w:color w:val="9AA0A6"/>
-          <w:sz w:val="14"/>
-          <w:szCs w:val="14"/>
-        </w:rPr>
-        <w:t xml:space="preserve">AE-0011  </w:t>
-      </w:r>
-      <w:r>
-        <w:rPr>
-          <w:sz w:val="22"/>
-          <w:szCs w:val="22"/>
-        </w:rPr>
-        <w:t xml:space="preserve">O centro de gravidade muda à medida que a barriga cresce. Evite subir em bancos e escadas para alcançar algo do alto. Use sapatos baixos e antiderrapantes. Cuidado extra com pisos molhados e tapetes soltos.</w:t>
+        <w:t xml:space="preserve">Segurança da Gestante</w:t>
+      </w:r>
+    </w:p>
+    <w:p>
+      <w:pPr>
+        <w:spacing w:after="160" w:line="300"/>
+      </w:pPr>
+      <w:r>
+        <w:rPr>
+          <w:rFonts w:ascii="Consolas" w:cs="Consolas" w:eastAsia="Consolas" w:hAnsi="Consolas"/>
+          <w:color w:val="9AA0A6"/>
+          <w:sz w:val="14"/>
+          <w:szCs w:val="14"/>
+        </w:rPr>
+        <w:t xml:space="preserve">AE-0013  </w:t>
+      </w:r>
+      <w:r>
+        <w:rPr>
+          <w:sz w:val="22"/>
+          <w:szCs w:val="22"/>
+        </w:rPr>
+        <w:t xml:space="preserve">Cuidados para mamãe e bebê</w:t>
       </w:r>
     </w:p>
     <w:p>
@@ -681,28 +753,28 @@
           <w:sz w:val="26"/>
           <w:szCs w:val="26"/>
         </w:rPr>
-        <w:t xml:space="preserve">Cinto de Segurança</w:t>
-      </w:r>
-    </w:p>
-    <w:p>
-      <w:pPr>
-        <w:spacing w:after="160" w:line="300"/>
-      </w:pPr>
-      <w:r>
-        <w:rPr>
-          <w:rFonts w:ascii="Consolas" w:cs="Consolas" w:eastAsia="Consolas" w:hAnsi="Consolas"/>
-          <w:color w:val="9AA0A6"/>
-          <w:sz w:val="14"/>
-          <w:szCs w:val="14"/>
-        </w:rPr>
-        <w:t xml:space="preserve">AE-0012  </w:t>
-      </w:r>
-      <w:r>
-        <w:rPr>
-          <w:sz w:val="22"/>
-          <w:szCs w:val="22"/>
-        </w:rPr>
-        <w:t xml:space="preserve">O cinto deve passar POR BAIXO da barriga (sobre os quadris) e entre os seios. Nunca sobre o útero. Uso obrigatório no carro, mesmo no banco de trás.</w:t>
+        <w:t xml:space="preserve">Prevenção de Quedas</w:t>
+      </w:r>
+    </w:p>
+    <w:p>
+      <w:pPr>
+        <w:spacing w:after="160" w:line="300"/>
+      </w:pPr>
+      <w:r>
+        <w:rPr>
+          <w:rFonts w:ascii="Consolas" w:cs="Consolas" w:eastAsia="Consolas" w:hAnsi="Consolas"/>
+          <w:color w:val="9AA0A6"/>
+          <w:sz w:val="14"/>
+          <w:szCs w:val="14"/>
+        </w:rPr>
+        <w:t xml:space="preserve">AE-0014  </w:t>
+      </w:r>
+      <w:r>
+        <w:rPr>
+          <w:sz w:val="22"/>
+          <w:szCs w:val="22"/>
+        </w:rPr>
+        <w:t xml:space="preserve">O centro de gravidade muda à medida que a barriga cresce. Evite subir em bancos e escadas para alcançar algo do alto. Use sapatos baixos e antiderrapantes. Cuidado extra com pisos molhados e tapetes soltos.</w:t>
       </w:r>
     </w:p>
     <w:p>
@@ -717,28 +789,28 @@
           <w:sz w:val="26"/>
           <w:szCs w:val="26"/>
         </w:rPr>
-        <w:t xml:space="preserve">Produtos Químicos</w:t>
-      </w:r>
-    </w:p>
-    <w:p>
-      <w:pPr>
-        <w:spacing w:after="160" w:line="300"/>
-      </w:pPr>
-      <w:r>
-        <w:rPr>
-          <w:rFonts w:ascii="Consolas" w:cs="Consolas" w:eastAsia="Consolas" w:hAnsi="Consolas"/>
-          <w:color w:val="9AA0A6"/>
-          <w:sz w:val="14"/>
-          <w:szCs w:val="14"/>
-        </w:rPr>
-        <w:t xml:space="preserve">AE-0013  </w:t>
-      </w:r>
-      <w:r>
-        <w:rPr>
-          <w:sz w:val="22"/>
-          <w:szCs w:val="22"/>
-        </w:rPr>
-        <w:t xml:space="preserve">Evite tintas fortes, solventes, inseticidas e produtos de limpeza com vapores tóxicos (amônia/cloro puro). Use luvas e máscaras se precisar manusear, ou peça ajuda. Manuseie sempre em ambientes abertos e ventilados</w:t>
+        <w:t xml:space="preserve">Cinto de Segurança</w:t>
+      </w:r>
+    </w:p>
+    <w:p>
+      <w:pPr>
+        <w:spacing w:after="160" w:line="300"/>
+      </w:pPr>
+      <w:r>
+        <w:rPr>
+          <w:rFonts w:ascii="Consolas" w:cs="Consolas" w:eastAsia="Consolas" w:hAnsi="Consolas"/>
+          <w:color w:val="9AA0A6"/>
+          <w:sz w:val="14"/>
+          <w:szCs w:val="14"/>
+        </w:rPr>
+        <w:t xml:space="preserve">AE-0015  </w:t>
+      </w:r>
+      <w:r>
+        <w:rPr>
+          <w:sz w:val="22"/>
+          <w:szCs w:val="22"/>
+        </w:rPr>
+        <w:t xml:space="preserve">O cinto deve passar POR BAIXO da barriga (sobre os quadris) e entre os seios. Nunca sobre o útero. Uso obrigatório no carro, mesmo no banco de trás.</w:t>
       </w:r>
     </w:p>
     <w:p>
@@ -753,28 +825,28 @@
           <w:sz w:val="26"/>
           <w:szCs w:val="26"/>
         </w:rPr>
-        <w:t xml:space="preserve">Sinais de Alerta</w:t>
-      </w:r>
-    </w:p>
-    <w:p>
-      <w:pPr>
-        <w:spacing w:after="160" w:line="300"/>
-      </w:pPr>
-      <w:r>
-        <w:rPr>
-          <w:rFonts w:ascii="Consolas" w:cs="Consolas" w:eastAsia="Consolas" w:hAnsi="Consolas"/>
-          <w:color w:val="9AA0A6"/>
-          <w:sz w:val="14"/>
-          <w:szCs w:val="14"/>
-        </w:rPr>
-        <w:t xml:space="preserve">AE-0014  </w:t>
-      </w:r>
-      <w:r>
-        <w:rPr>
-          <w:sz w:val="22"/>
-          <w:szCs w:val="22"/>
-        </w:rPr>
-        <w:t xml:space="preserve">Dor abdominal intensa, sangramento, visão turva, inchaço súbito (rosto/mãos) ou febre exigem ida imediata ao médico. Tenha a mala da maternidade pronta a partir do 7º mês.</w:t>
+        <w:t xml:space="preserve">Produtos Químicos</w:t>
+      </w:r>
+    </w:p>
+    <w:p>
+      <w:pPr>
+        <w:spacing w:after="160" w:line="300"/>
+      </w:pPr>
+      <w:r>
+        <w:rPr>
+          <w:rFonts w:ascii="Consolas" w:cs="Consolas" w:eastAsia="Consolas" w:hAnsi="Consolas"/>
+          <w:color w:val="9AA0A6"/>
+          <w:sz w:val="14"/>
+          <w:szCs w:val="14"/>
+        </w:rPr>
+        <w:t xml:space="preserve">AE-0016  </w:t>
+      </w:r>
+      <w:r>
+        <w:rPr>
+          <w:sz w:val="22"/>
+          <w:szCs w:val="22"/>
+        </w:rPr>
+        <w:t xml:space="preserve">Evite tintas fortes, solventes, inseticidas e produtos de limpeza com vapores tóxicos (amônia/cloro puro). Use luvas e máscaras se precisar manusear, ou peça ajuda. Manuseie sempre em ambientes abertos e ventilados</w:t>
       </w:r>
     </w:p>
     <w:p>
@@ -789,6 +861,42 @@
           <w:sz w:val="26"/>
           <w:szCs w:val="26"/>
         </w:rPr>
+        <w:t xml:space="preserve">Sinais de Alerta</w:t>
+      </w:r>
+    </w:p>
+    <w:p>
+      <w:pPr>
+        <w:spacing w:after="160" w:line="300"/>
+      </w:pPr>
+      <w:r>
+        <w:rPr>
+          <w:rFonts w:ascii="Consolas" w:cs="Consolas" w:eastAsia="Consolas" w:hAnsi="Consolas"/>
+          <w:color w:val="9AA0A6"/>
+          <w:sz w:val="14"/>
+          <w:szCs w:val="14"/>
+        </w:rPr>
+        <w:t xml:space="preserve">AE-0017  </w:t>
+      </w:r>
+      <w:r>
+        <w:rPr>
+          <w:sz w:val="22"/>
+          <w:szCs w:val="22"/>
+        </w:rPr>
+        <w:t xml:space="preserve">Dor abdominal intensa, sangramento, visão turva, inchaço súbito (rosto/mãos) ou febre exigem ida imediata ao médico. Tenha a mala da maternidade pronta a partir do 7º mês.</w:t>
+      </w:r>
+    </w:p>
+    <w:p>
+      <w:pPr>
+        <w:pStyle w:val="Heading2"/>
+        <w:spacing w:after="120" w:before="280"/>
+      </w:pPr>
+      <w:r>
+        <w:rPr>
+          <w:b/>
+          <w:bCs/>
+          <w:sz w:val="26"/>
+          <w:szCs w:val="26"/>
+        </w:rPr>
         <w:t xml:space="preserve">Zika e Dengue</w:t>
       </w:r>
     </w:p>
@@ -803,7 +911,7 @@
           <w:sz w:val="14"/>
           <w:szCs w:val="14"/>
         </w:rPr>
-        <w:t xml:space="preserve">AE-0015  </w:t>
+        <w:t xml:space="preserve">AE-0018  </w:t>
       </w:r>
       <w:r>
         <w:rPr>
@@ -842,28 +950,28 @@
           <w:sz w:val="26"/>
           <w:szCs w:val="26"/>
         </w:rPr>
-        <w:t xml:space="preserve">Extintores de Incêndio</w:t>
-      </w:r>
-    </w:p>
-    <w:p>
-      <w:pPr>
-        <w:spacing w:after="160" w:line="300"/>
-      </w:pPr>
-      <w:r>
-        <w:rPr>
-          <w:rFonts w:ascii="Consolas" w:cs="Consolas" w:eastAsia="Consolas" w:hAnsi="Consolas"/>
-          <w:color w:val="9AA0A6"/>
-          <w:sz w:val="14"/>
-          <w:szCs w:val="14"/>
-        </w:rPr>
-        <w:t xml:space="preserve">AE-0016  </w:t>
-      </w:r>
-      <w:r>
-        <w:rPr>
-          <w:sz w:val="22"/>
-          <w:szCs w:val="22"/>
-        </w:rPr>
-        <w:t xml:space="preserve">Observe o MANÔMETRO: O ponteiro deve estar na faixa VERDE. Se estiver no vermelho ou se aproximando dele, considere que o extintor está despressurizado. Verifique também se o lacre plástico está intacto e se a data de validade da carga (em {{CERT_SEAL}}) não expirou. Oriente o responsável para que garanta que a validade do cilindro não esteja vencida.</w:t>
+        <w:t xml:space="preserve">Segurança em Condomínio</w:t>
+      </w:r>
+    </w:p>
+    <w:p>
+      <w:pPr>
+        <w:spacing w:after="160" w:line="300"/>
+      </w:pPr>
+      <w:r>
+        <w:rPr>
+          <w:rFonts w:ascii="Consolas" w:cs="Consolas" w:eastAsia="Consolas" w:hAnsi="Consolas"/>
+          <w:color w:val="9AA0A6"/>
+          <w:sz w:val="14"/>
+          <w:szCs w:val="14"/>
+        </w:rPr>
+        <w:t xml:space="preserve">AE-0019  </w:t>
+      </w:r>
+      <w:r>
+        <w:rPr>
+          <w:sz w:val="22"/>
+          <w:szCs w:val="22"/>
+        </w:rPr>
+        <w:t xml:space="preserve">O que observar nas áreas comuns do seu prédio</w:t>
       </w:r>
     </w:p>
     <w:p>
@@ -878,28 +986,28 @@
           <w:sz w:val="26"/>
           <w:szCs w:val="26"/>
         </w:rPr>
-        <w:t xml:space="preserve">Saídas de Emergência</w:t>
-      </w:r>
-    </w:p>
-    <w:p>
-      <w:pPr>
-        <w:spacing w:after="160" w:line="300"/>
-      </w:pPr>
-      <w:r>
-        <w:rPr>
-          <w:rFonts w:ascii="Consolas" w:cs="Consolas" w:eastAsia="Consolas" w:hAnsi="Consolas"/>
-          <w:color w:val="9AA0A6"/>
-          <w:sz w:val="14"/>
-          <w:szCs w:val="14"/>
-        </w:rPr>
-        <w:t xml:space="preserve">AE-0017  </w:t>
-      </w:r>
-      <w:r>
-        <w:rPr>
-          <w:sz w:val="22"/>
-          <w:szCs w:val="22"/>
-        </w:rPr>
-        <w:t xml:space="preserve">As portas corta-fogo devem estar SEMPRE FECHADAS, mas nunca trancadas à chave. Elas impedem que a fumaça invada as escadas. Verifique se não há objetos (bicicletas, vasos, lixo) obstruindo os corredores ou escadas.</w:t>
+        <w:t xml:space="preserve">Extintores de Incêndio</w:t>
+      </w:r>
+    </w:p>
+    <w:p>
+      <w:pPr>
+        <w:spacing w:after="160" w:line="300"/>
+      </w:pPr>
+      <w:r>
+        <w:rPr>
+          <w:rFonts w:ascii="Consolas" w:cs="Consolas" w:eastAsia="Consolas" w:hAnsi="Consolas"/>
+          <w:color w:val="9AA0A6"/>
+          <w:sz w:val="14"/>
+          <w:szCs w:val="14"/>
+        </w:rPr>
+        <w:t xml:space="preserve">AE-0020  </w:t>
+      </w:r>
+      <w:r>
+        <w:rPr>
+          <w:sz w:val="22"/>
+          <w:szCs w:val="22"/>
+        </w:rPr>
+        <w:t xml:space="preserve">Observe o MANÔMETRO: O ponteiro deve estar na faixa VERDE. Se estiver no vermelho ou se aproximando dele, considere que o extintor está despressurizado. Verifique também se o lacre plástico está intacto e se a data de validade da carga (em {{CERT_SEAL}}) não expirou. Oriente o responsável para que garanta que a validade do cilindro não esteja vencida.</w:t>
       </w:r>
     </w:p>
     <w:p>
@@ -914,28 +1022,28 @@
           <w:sz w:val="26"/>
           <w:szCs w:val="26"/>
         </w:rPr>
-        <w:t xml:space="preserve">Playground e Parquinho</w:t>
-      </w:r>
-    </w:p>
-    <w:p>
-      <w:pPr>
-        <w:spacing w:after="160" w:line="300"/>
-      </w:pPr>
-      <w:r>
-        <w:rPr>
-          <w:rFonts w:ascii="Consolas" w:cs="Consolas" w:eastAsia="Consolas" w:hAnsi="Consolas"/>
-          <w:color w:val="9AA0A6"/>
-          <w:sz w:val="14"/>
-          <w:szCs w:val="14"/>
-        </w:rPr>
-        <w:t xml:space="preserve">AE-0018  </w:t>
-      </w:r>
-      <w:r>
-        <w:rPr>
-          <w:sz w:val="22"/>
-          <w:szCs w:val="22"/>
-        </w:rPr>
-        <w:t xml:space="preserve">Balance os brinquedos para checar fixação ou folgas. Procure por ferrugem exposta, parafusos soltos ou farpas de madeira ou rebarbas. O piso deve ser de material que absorva impacto (areia, grama ou borracha), nunca concreto puro.</w:t>
+        <w:t xml:space="preserve">Saídas de Emergência</w:t>
+      </w:r>
+    </w:p>
+    <w:p>
+      <w:pPr>
+        <w:spacing w:after="160" w:line="300"/>
+      </w:pPr>
+      <w:r>
+        <w:rPr>
+          <w:rFonts w:ascii="Consolas" w:cs="Consolas" w:eastAsia="Consolas" w:hAnsi="Consolas"/>
+          <w:color w:val="9AA0A6"/>
+          <w:sz w:val="14"/>
+          <w:szCs w:val="14"/>
+        </w:rPr>
+        <w:t xml:space="preserve">AE-0021  </w:t>
+      </w:r>
+      <w:r>
+        <w:rPr>
+          <w:sz w:val="22"/>
+          <w:szCs w:val="22"/>
+        </w:rPr>
+        <w:t xml:space="preserve">As portas corta-fogo devem estar SEMPRE FECHADAS, mas nunca trancadas à chave. Elas impedem que a fumaça invada as escadas. Verifique se não há objetos (bicicletas, vasos, lixo) obstruindo os corredores ou escadas.</w:t>
       </w:r>
     </w:p>
     <w:p>
@@ -950,28 +1058,28 @@
           <w:sz w:val="26"/>
           <w:szCs w:val="26"/>
         </w:rPr>
-        <w:t xml:space="preserve">Elevadores</w:t>
-      </w:r>
-    </w:p>
-    <w:p>
-      <w:pPr>
-        <w:spacing w:after="160" w:line="300"/>
-      </w:pPr>
-      <w:r>
-        <w:rPr>
-          <w:rFonts w:ascii="Consolas" w:cs="Consolas" w:eastAsia="Consolas" w:hAnsi="Consolas"/>
-          <w:color w:val="9AA0A6"/>
-          <w:sz w:val="14"/>
-          <w:szCs w:val="14"/>
-        </w:rPr>
-        <w:t xml:space="preserve">AE-0019  </w:t>
-      </w:r>
-      <w:r>
-        <w:rPr>
-          <w:sz w:val="22"/>
-          <w:szCs w:val="22"/>
-        </w:rPr>
-        <w:t xml:space="preserve">Nunca use elevadores em caso de incêndio. Verifique se o desnível entre a cabine e o andar é seguro. Crianças menores de 10 anos não devem usar o elevador desacompanhadas.</w:t>
+        <w:t xml:space="preserve">Playground e Parquinho</w:t>
+      </w:r>
+    </w:p>
+    <w:p>
+      <w:pPr>
+        <w:spacing w:after="160" w:line="300"/>
+      </w:pPr>
+      <w:r>
+        <w:rPr>
+          <w:rFonts w:ascii="Consolas" w:cs="Consolas" w:eastAsia="Consolas" w:hAnsi="Consolas"/>
+          <w:color w:val="9AA0A6"/>
+          <w:sz w:val="14"/>
+          <w:szCs w:val="14"/>
+        </w:rPr>
+        <w:t xml:space="preserve">AE-0022  </w:t>
+      </w:r>
+      <w:r>
+        <w:rPr>
+          <w:sz w:val="22"/>
+          <w:szCs w:val="22"/>
+        </w:rPr>
+        <w:t xml:space="preserve">Balance os brinquedos para checar fixação ou folgas. Procure por ferrugem exposta, parafusos soltos ou farpas de madeira ou rebarbas. O piso deve ser de material que absorva impacto (areia, grama ou borracha), nunca concreto puro.</w:t>
       </w:r>
     </w:p>
     <w:p>
@@ -986,28 +1094,28 @@
           <w:sz w:val="26"/>
           <w:szCs w:val="26"/>
         </w:rPr>
-        <w:t xml:space="preserve">Piscinas Coletivas</w:t>
-      </w:r>
-    </w:p>
-    <w:p>
-      <w:pPr>
-        <w:spacing w:after="160" w:line="300"/>
-      </w:pPr>
-      <w:r>
-        <w:rPr>
-          <w:rFonts w:ascii="Consolas" w:cs="Consolas" w:eastAsia="Consolas" w:hAnsi="Consolas"/>
-          <w:color w:val="9AA0A6"/>
-          <w:sz w:val="14"/>
-          <w:szCs w:val="14"/>
-        </w:rPr>
-        <w:t xml:space="preserve">AE-0020  </w:t>
-      </w:r>
-      <w:r>
-        <w:rPr>
-          <w:sz w:val="22"/>
-          <w:szCs w:val="22"/>
-        </w:rPr>
-        <w:t xml:space="preserve">O ralo de fundo deve ser do tipo 'anti-aprisionamento' (gradeado que não suga cabelo). O botão de parada de emergência da bomba deve estar visível e sinalizado.</w:t>
+        <w:t xml:space="preserve">Elevadores</w:t>
+      </w:r>
+    </w:p>
+    <w:p>
+      <w:pPr>
+        <w:spacing w:after="160" w:line="300"/>
+      </w:pPr>
+      <w:r>
+        <w:rPr>
+          <w:rFonts w:ascii="Consolas" w:cs="Consolas" w:eastAsia="Consolas" w:hAnsi="Consolas"/>
+          <w:color w:val="9AA0A6"/>
+          <w:sz w:val="14"/>
+          <w:szCs w:val="14"/>
+        </w:rPr>
+        <w:t xml:space="preserve">AE-0023  </w:t>
+      </w:r>
+      <w:r>
+        <w:rPr>
+          <w:sz w:val="22"/>
+          <w:szCs w:val="22"/>
+        </w:rPr>
+        <w:t xml:space="preserve">Nunca use elevadores em caso de incêndio. Verifique se o desnível entre a cabine e o andar é seguro. Crianças menores de 10 anos não devem usar o elevador desacompanhadas.</w:t>
       </w:r>
     </w:p>
     <w:p>
@@ -1017,42 +1125,33 @@
       </w:pPr>
       <w:r>
         <w:rPr>
-          <w:rFonts w:ascii="Consolas" w:cs="Consolas" w:eastAsia="Consolas" w:hAnsi="Consolas"/>
-          <w:color w:val="9AA0A6"/>
-          <w:sz w:val="14"/>
-          <w:szCs w:val="14"/>
-        </w:rPr>
-        <w:t xml:space="preserve">AE-0021  </w:t>
-      </w:r>
-      <w:r>
-        <w:rPr>
           <w:b/>
           <w:bCs/>
           <w:sz w:val="26"/>
           <w:szCs w:val="26"/>
         </w:rPr>
-        <w:t xml:space="preserve">Estacionamentos e Garagens</w:t>
-      </w:r>
-    </w:p>
-    <w:p>
-      <w:pPr>
-        <w:spacing w:after="160" w:line="300"/>
-      </w:pPr>
-      <w:r>
-        <w:rPr>
-          <w:rFonts w:ascii="Consolas" w:cs="Consolas" w:eastAsia="Consolas" w:hAnsi="Consolas"/>
-          <w:color w:val="9AA0A6"/>
-          <w:sz w:val="14"/>
-          <w:szCs w:val="14"/>
-        </w:rPr>
-        <w:t xml:space="preserve">AE-0022  </w:t>
-      </w:r>
-      <w:r>
-        <w:rPr>
-          <w:sz w:val="22"/>
-          <w:szCs w:val="22"/>
-        </w:rPr>
-        <w:t xml:space="preserve">Área de alto risco para crianças! Pontos cegos em manobras e fluxo de entrada/saída são críticos. NUNCA permita brincadeiras nesta área. Mantenha velocidade reduzida e faróis acesos.</w:t>
+        <w:t xml:space="preserve">Piscinas Coletivas</w:t>
+      </w:r>
+    </w:p>
+    <w:p>
+      <w:pPr>
+        <w:spacing w:after="160" w:line="300"/>
+      </w:pPr>
+      <w:r>
+        <w:rPr>
+          <w:rFonts w:ascii="Consolas" w:cs="Consolas" w:eastAsia="Consolas" w:hAnsi="Consolas"/>
+          <w:color w:val="9AA0A6"/>
+          <w:sz w:val="14"/>
+          <w:szCs w:val="14"/>
+        </w:rPr>
+        <w:t xml:space="preserve">AE-0024  </w:t>
+      </w:r>
+      <w:r>
+        <w:rPr>
+          <w:sz w:val="22"/>
+          <w:szCs w:val="22"/>
+        </w:rPr>
+        <w:t xml:space="preserve">O ralo de fundo deve ser do tipo 'anti-aprisionamento' (gradeado que não suga cabelo). O botão de parada de emergência da bomba deve estar visível e sinalizado.</w:t>
       </w:r>
     </w:p>
     <w:p>
@@ -1067,7 +1166,7 @@
           <w:sz w:val="14"/>
           <w:szCs w:val="14"/>
         </w:rPr>
-        <w:t xml:space="preserve">AE-0023  </w:t>
+        <w:t xml:space="preserve">AE-0025  </w:t>
       </w:r>
       <w:r>
         <w:rPr>
@@ -1076,6 +1175,51 @@
           <w:sz w:val="26"/>
           <w:szCs w:val="26"/>
         </w:rPr>
+        <w:t xml:space="preserve">Estacionamentos e Garagens</w:t>
+      </w:r>
+    </w:p>
+    <w:p>
+      <w:pPr>
+        <w:spacing w:after="160" w:line="300"/>
+      </w:pPr>
+      <w:r>
+        <w:rPr>
+          <w:rFonts w:ascii="Consolas" w:cs="Consolas" w:eastAsia="Consolas" w:hAnsi="Consolas"/>
+          <w:color w:val="9AA0A6"/>
+          <w:sz w:val="14"/>
+          <w:szCs w:val="14"/>
+        </w:rPr>
+        <w:t xml:space="preserve">AE-0026  </w:t>
+      </w:r>
+      <w:r>
+        <w:rPr>
+          <w:sz w:val="22"/>
+          <w:szCs w:val="22"/>
+        </w:rPr>
+        <w:t xml:space="preserve">Área de alto risco para crianças! Pontos cegos em manobras e fluxo de entrada/saída são críticos. NUNCA permita brincadeiras nesta área. Mantenha velocidade reduzida e faróis acesos.</w:t>
+      </w:r>
+    </w:p>
+    <w:p>
+      <w:pPr>
+        <w:pStyle w:val="Heading2"/>
+        <w:spacing w:after="120" w:before="280"/>
+      </w:pPr>
+      <w:r>
+        <w:rPr>
+          <w:rFonts w:ascii="Consolas" w:cs="Consolas" w:eastAsia="Consolas" w:hAnsi="Consolas"/>
+          <w:color w:val="9AA0A6"/>
+          <w:sz w:val="14"/>
+          <w:szCs w:val="14"/>
+        </w:rPr>
+        <w:t xml:space="preserve">AE-0027  </w:t>
+      </w:r>
+      <w:r>
+        <w:rPr>
+          <w:b/>
+          <w:bCs/>
+          <w:sz w:val="26"/>
+          <w:szCs w:val="26"/>
+        </w:rPr>
         <w:t xml:space="preserve">Áreas de Serviço e Utilidades</w:t>
       </w:r>
     </w:p>
@@ -1090,7 +1234,7 @@
           <w:sz w:val="14"/>
           <w:szCs w:val="14"/>
         </w:rPr>
-        <w:t xml:space="preserve">AE-0024  </w:t>
+        <w:t xml:space="preserve">AE-0028  </w:t>
       </w:r>
       <w:r>
         <w:rPr>
@@ -1129,7 +1273,7 @@
           <w:sz w:val="14"/>
           <w:szCs w:val="14"/>
         </w:rPr>
-        <w:t xml:space="preserve">AE-0025  </w:t>
+        <w:t xml:space="preserve">AE-0029  </w:t>
       </w:r>
       <w:r>
         <w:rPr>
@@ -1168,14 +1312,14 @@
           <w:sz w:val="14"/>
           <w:szCs w:val="14"/>
         </w:rPr>
-        <w:t xml:space="preserve">AE-0026  </w:t>
-      </w:r>
-      <w:r>
-        <w:rPr>
-          <w:sz w:val="22"/>
-          <w:szCs w:val="22"/>
-        </w:rPr>
-        <w:t xml:space="preserve">O gás de cozinha é mais pesado que o ar e se acumula no chão e nos ralos. Em ambiente fechado, qualquer faísca — até a do interruptor de luz — pode causar uma explosão violenta.</w:t>
+        <w:t xml:space="preserve">AE-0030  </w:t>
+      </w:r>
+      <w:r>
+        <w:rPr>
+          <w:sz w:val="22"/>
+          <w:szCs w:val="22"/>
+        </w:rPr>
+        <w:t xml:space="preserve">O gás de cozinha, por ser mais pesado que o ar, se acumula no chão e nos ralos. Em ambientes fechados, qualquer faísca leve — até a do interruptor de luz — pode causar uma explosão violenta.</w:t>
       </w:r>
     </w:p>
     <w:p>
@@ -1190,7 +1334,7 @@
           <w:sz w:val="14"/>
           <w:szCs w:val="14"/>
         </w:rPr>
-        <w:t xml:space="preserve">AE-0027  </w:t>
+        <w:t xml:space="preserve">AE-0031  </w:t>
       </w:r>
       <w:r>
         <w:rPr>
@@ -1261,7 +1405,7 @@
           <w:sz w:val="14"/>
           <w:szCs w:val="14"/>
         </w:rPr>
-        <w:t xml:space="preserve">AE-0028  </w:t>
+        <w:t xml:space="preserve">AE-0032  </w:t>
       </w:r>
       <w:r>
         <w:rPr>
@@ -1297,7 +1441,7 @@
           <w:sz w:val="14"/>
           <w:szCs w:val="14"/>
         </w:rPr>
-        <w:t xml:space="preserve">AE-0029  </w:t>
+        <w:t xml:space="preserve">AE-0033  </w:t>
       </w:r>
       <w:r>
         <w:rPr>
@@ -1333,7 +1477,7 @@
           <w:sz w:val="14"/>
           <w:szCs w:val="14"/>
         </w:rPr>
-        <w:t xml:space="preserve">AE-0030  </w:t>
+        <w:t xml:space="preserve">AE-0034  </w:t>
       </w:r>
       <w:r>
         <w:rPr>
@@ -1372,7 +1516,7 @@
           <w:sz w:val="14"/>
           <w:szCs w:val="14"/>
         </w:rPr>
-        <w:t xml:space="preserve">AE-0031  </w:t>
+        <w:t xml:space="preserve">AE-0035  </w:t>
       </w:r>
       <w:r>
         <w:rPr>
@@ -1382,6 +1526,27 @@
           <w:szCs w:val="26"/>
         </w:rPr>
         <w:t xml:space="preserve">Guia de Brinquedos (Expert)</w:t>
+      </w:r>
+    </w:p>
+    <w:p>
+      <w:pPr>
+        <w:spacing w:after="160" w:line="300"/>
+      </w:pPr>
+      <w:r>
+        <w:rPr>
+          <w:rFonts w:ascii="Consolas" w:cs="Consolas" w:eastAsia="Consolas" w:hAnsi="Consolas"/>
+          <w:color w:val="9AA0A6"/>
+          <w:sz w:val="14"/>
+          <w:szCs w:val="14"/>
+        </w:rPr>
+        <w:t xml:space="preserve">AE-0036  </w:t>
+      </w:r>
+      <w:r>
+        <w:rPr>
+          <w:sz w:val="22"/>
+          <w:szCs w:val="22"/>
+        </w:rPr>
+        <w:t xml:space="preserve">Segurança, Compra e Auditoria</w:t>
       </w:r>
     </w:p>
     <w:p>
@@ -1411,7 +1576,7 @@
           <w:sz w:val="14"/>
           <w:szCs w:val="14"/>
         </w:rPr>
-        <w:t xml:space="preserve">AE-0032  </w:t>
+        <w:t xml:space="preserve">AE-0037  </w:t>
       </w:r>
       <w:r>
         <w:rPr>
@@ -1433,7 +1598,7 @@
           <w:sz w:val="14"/>
           <w:szCs w:val="14"/>
         </w:rPr>
-        <w:t xml:space="preserve">AE-0033  </w:t>
+        <w:t xml:space="preserve">AE-0038  </w:t>
       </w:r>
       <w:r>
         <w:rPr>
@@ -1456,7 +1621,7 @@
           <w:sz w:val="14"/>
           <w:szCs w:val="14"/>
         </w:rPr>
-        <w:t xml:space="preserve">AE-0034  </w:t>
+        <w:t xml:space="preserve">AE-0039  </w:t>
       </w:r>
       <w:r>
         <w:rPr>
@@ -1526,7 +1691,7 @@
           <w:sz w:val="14"/>
           <w:szCs w:val="14"/>
         </w:rPr>
-        <w:t xml:space="preserve">AE-0035  </w:t>
+        <w:t xml:space="preserve">AE-0040  </w:t>
       </w:r>
       <w:r>
         <w:rPr>
@@ -1549,7 +1714,7 @@
           <w:sz w:val="14"/>
           <w:szCs w:val="14"/>
         </w:rPr>
-        <w:t xml:space="preserve">AE-0036  </w:t>
+        <w:t xml:space="preserve">AE-0041  </w:t>
       </w:r>
       <w:r>
         <w:rPr>
@@ -1603,7 +1768,7 @@
           <w:sz w:val="14"/>
           <w:szCs w:val="14"/>
         </w:rPr>
-        <w:t xml:space="preserve">AE-0037  </w:t>
+        <w:t xml:space="preserve">AE-0042  </w:t>
       </w:r>
       <w:r>
         <w:rPr>
@@ -1626,7 +1791,7 @@
           <w:sz w:val="14"/>
           <w:szCs w:val="14"/>
         </w:rPr>
-        <w:t xml:space="preserve">AE-0038  </w:t>
+        <w:t xml:space="preserve">AE-0043  </w:t>
       </w:r>
       <w:r>
         <w:rPr>
@@ -1680,7 +1845,7 @@
           <w:sz w:val="14"/>
           <w:szCs w:val="14"/>
         </w:rPr>
-        <w:t xml:space="preserve">AE-0039  </w:t>
+        <w:t xml:space="preserve">AE-0044  </w:t>
       </w:r>
       <w:r>
         <w:rPr>
@@ -1703,7 +1868,7 @@
           <w:sz w:val="14"/>
           <w:szCs w:val="14"/>
         </w:rPr>
-        <w:t xml:space="preserve">AE-0040  </w:t>
+        <w:t xml:space="preserve">AE-0045  </w:t>
       </w:r>
       <w:r>
         <w:rPr>
@@ -1755,7 +1920,7 @@
           <w:sz w:val="14"/>
           <w:szCs w:val="14"/>
         </w:rPr>
-        <w:t xml:space="preserve">AE-0041  </w:t>
+        <w:t xml:space="preserve">AE-0046  </w:t>
       </w:r>
       <w:r>
         <w:rPr>
@@ -1793,7 +1958,7 @@
           <w:sz w:val="14"/>
           <w:szCs w:val="14"/>
         </w:rPr>
-        <w:t xml:space="preserve">AE-0042  </w:t>
+        <w:t xml:space="preserve">AE-0047  </w:t>
       </w:r>
       <w:r>
         <w:rPr>
@@ -1816,7 +1981,7 @@
           <w:sz w:val="14"/>
           <w:szCs w:val="14"/>
         </w:rPr>
-        <w:t xml:space="preserve">AE-0043  </w:t>
+        <w:t xml:space="preserve">AE-0048  </w:t>
       </w:r>
       <w:r>
         <w:rPr>
@@ -1863,28 +2028,28 @@
           <w:sz w:val="26"/>
           <w:szCs w:val="26"/>
         </w:rPr>
-        <w:t xml:space="preserve">Casa Segura (Quedas)</w:t>
-      </w:r>
-    </w:p>
-    <w:p>
-      <w:pPr>
-        <w:spacing w:after="160" w:line="300"/>
-      </w:pPr>
-      <w:r>
-        <w:rPr>
-          <w:rFonts w:ascii="Consolas" w:cs="Consolas" w:eastAsia="Consolas" w:hAnsi="Consolas"/>
-          <w:color w:val="9AA0A6"/>
-          <w:sz w:val="14"/>
-          <w:szCs w:val="14"/>
-        </w:rPr>
-        <w:t xml:space="preserve">AE-0044  </w:t>
-      </w:r>
-      <w:r>
-        <w:rPr>
-          <w:sz w:val="22"/>
-          <w:szCs w:val="22"/>
-        </w:rPr>
-        <w:t xml:space="preserve">Remova tapetes soltos ou fixe com fitas dupla-face. Melhore a iluminação (luzes noturnas no corredor). Instale barras de apoio no box e vaso sanitário.</w:t>
+        <w:t xml:space="preserve">Mobilidade e Idosos</w:t>
+      </w:r>
+    </w:p>
+    <w:p>
+      <w:pPr>
+        <w:spacing w:after="160" w:line="300"/>
+      </w:pPr>
+      <w:r>
+        <w:rPr>
+          <w:rFonts w:ascii="Consolas" w:cs="Consolas" w:eastAsia="Consolas" w:hAnsi="Consolas"/>
+          <w:color w:val="9AA0A6"/>
+          <w:sz w:val="14"/>
+          <w:szCs w:val="14"/>
+        </w:rPr>
+        <w:t xml:space="preserve">AE-0049  </w:t>
+      </w:r>
+      <w:r>
+        <w:rPr>
+          <w:sz w:val="22"/>
+          <w:szCs w:val="22"/>
+        </w:rPr>
+        <w:t xml:space="preserve">Acessibilidade e prevenção de quedas</w:t>
       </w:r>
     </w:p>
     <w:p>
@@ -1899,28 +2064,28 @@
           <w:sz w:val="26"/>
           <w:szCs w:val="26"/>
         </w:rPr>
-        <w:t xml:space="preserve">Adaptações Simples</w:t>
-      </w:r>
-    </w:p>
-    <w:p>
-      <w:pPr>
-        <w:spacing w:after="160" w:line="300"/>
-      </w:pPr>
-      <w:r>
-        <w:rPr>
-          <w:rFonts w:ascii="Consolas" w:cs="Consolas" w:eastAsia="Consolas" w:hAnsi="Consolas"/>
-          <w:color w:val="9AA0A6"/>
-          <w:sz w:val="14"/>
-          <w:szCs w:val="14"/>
-        </w:rPr>
-        <w:t xml:space="preserve">AE-0045  </w:t>
-      </w:r>
-      <w:r>
-        <w:rPr>
-          <w:sz w:val="22"/>
-          <w:szCs w:val="22"/>
-        </w:rPr>
-        <w:t xml:space="preserve">Eleve a altura de camas, sofás e poltronas (calços) para facilitar o levantar e se sentar. Use maçanetas tipo alavanca. Mantenha objetos de uso diário em prateleiras baixas.</w:t>
+        <w:t xml:space="preserve">Casa Segura (Quedas)</w:t>
+      </w:r>
+    </w:p>
+    <w:p>
+      <w:pPr>
+        <w:spacing w:after="160" w:line="300"/>
+      </w:pPr>
+      <w:r>
+        <w:rPr>
+          <w:rFonts w:ascii="Consolas" w:cs="Consolas" w:eastAsia="Consolas" w:hAnsi="Consolas"/>
+          <w:color w:val="9AA0A6"/>
+          <w:sz w:val="14"/>
+          <w:szCs w:val="14"/>
+        </w:rPr>
+        <w:t xml:space="preserve">AE-0050  </w:t>
+      </w:r>
+      <w:r>
+        <w:rPr>
+          <w:sz w:val="22"/>
+          <w:szCs w:val="22"/>
+        </w:rPr>
+        <w:t xml:space="preserve">Remova tapetes soltos ou fixe com fitas dupla-face. Melhore a iluminação (luzes noturnas no corredor). Instale barras de apoio no box e vaso sanitário.</w:t>
       </w:r>
     </w:p>
     <w:p>
@@ -1935,28 +2100,28 @@
           <w:sz w:val="26"/>
           <w:szCs w:val="26"/>
         </w:rPr>
-        <w:t xml:space="preserve">Segurança no Banho</w:t>
-      </w:r>
-    </w:p>
-    <w:p>
-      <w:pPr>
-        <w:spacing w:after="160" w:line="300"/>
-      </w:pPr>
-      <w:r>
-        <w:rPr>
-          <w:rFonts w:ascii="Consolas" w:cs="Consolas" w:eastAsia="Consolas" w:hAnsi="Consolas"/>
-          <w:color w:val="9AA0A6"/>
-          <w:sz w:val="14"/>
-          <w:szCs w:val="14"/>
-        </w:rPr>
-        <w:t xml:space="preserve">AE-0046  </w:t>
-      </w:r>
-      <w:r>
-        <w:rPr>
-          <w:sz w:val="22"/>
-          <w:szCs w:val="22"/>
-        </w:rPr>
-        <w:t xml:space="preserve">Utilize cadeira de banho ou banco firme. Tapete antiderrapante dentro e fora do box. Caso o idoso ou pessoa tenha dificuldade de mobilidade ou limitação cognitiva, nunca deve ser deixada sem supervisão contínua. O banheiro (fechadura) deve abrir por fora.</w:t>
+        <w:t xml:space="preserve">Adaptações Simples</w:t>
+      </w:r>
+    </w:p>
+    <w:p>
+      <w:pPr>
+        <w:spacing w:after="160" w:line="300"/>
+      </w:pPr>
+      <w:r>
+        <w:rPr>
+          <w:rFonts w:ascii="Consolas" w:cs="Consolas" w:eastAsia="Consolas" w:hAnsi="Consolas"/>
+          <w:color w:val="9AA0A6"/>
+          <w:sz w:val="14"/>
+          <w:szCs w:val="14"/>
+        </w:rPr>
+        <w:t xml:space="preserve">AE-0051  </w:t>
+      </w:r>
+      <w:r>
+        <w:rPr>
+          <w:sz w:val="22"/>
+          <w:szCs w:val="22"/>
+        </w:rPr>
+        <w:t xml:space="preserve">Eleve a altura de camas, sofás e poltronas (calços) para facilitar o levantar e se sentar. Use maçanetas tipo alavanca. Mantenha objetos de uso diário em prateleiras baixas.</w:t>
       </w:r>
     </w:p>
     <w:p>
@@ -1971,28 +2136,28 @@
           <w:sz w:val="26"/>
           <w:szCs w:val="26"/>
         </w:rPr>
-        <w:t xml:space="preserve">Emergência</w:t>
-      </w:r>
-    </w:p>
-    <w:p>
-      <w:pPr>
-        <w:spacing w:after="160" w:line="300"/>
-      </w:pPr>
-      <w:r>
-        <w:rPr>
-          <w:rFonts w:ascii="Consolas" w:cs="Consolas" w:eastAsia="Consolas" w:hAnsi="Consolas"/>
-          <w:color w:val="9AA0A6"/>
-          <w:sz w:val="14"/>
-          <w:szCs w:val="14"/>
-        </w:rPr>
-        <w:t xml:space="preserve">AE-0047  </w:t>
-      </w:r>
-      <w:r>
-        <w:rPr>
-          <w:sz w:val="22"/>
-          <w:szCs w:val="22"/>
-        </w:rPr>
-        <w:t xml:space="preserve">Tenha um botão de pânico ou celular sempre ao alcance. Cadastre vizinhos na discagem rápida. Deixe uma chave extra com alguém de confiança.</w:t>
+        <w:t xml:space="preserve">Segurança no Banho</w:t>
+      </w:r>
+    </w:p>
+    <w:p>
+      <w:pPr>
+        <w:spacing w:after="160" w:line="300"/>
+      </w:pPr>
+      <w:r>
+        <w:rPr>
+          <w:rFonts w:ascii="Consolas" w:cs="Consolas" w:eastAsia="Consolas" w:hAnsi="Consolas"/>
+          <w:color w:val="9AA0A6"/>
+          <w:sz w:val="14"/>
+          <w:szCs w:val="14"/>
+        </w:rPr>
+        <w:t xml:space="preserve">AE-0052  </w:t>
+      </w:r>
+      <w:r>
+        <w:rPr>
+          <w:sz w:val="22"/>
+          <w:szCs w:val="22"/>
+        </w:rPr>
+        <w:t xml:space="preserve">Utilize cadeira de banho ou banco firme. Tapete antiderrapante dentro e fora do box. Caso o idoso ou pessoa tenha dificuldade de mobilidade ou limitação cognitiva, nunca deve ser deixada sem supervisão contínua. O banheiro (fechadura) deve abrir por fora.</w:t>
       </w:r>
     </w:p>
     <w:p>
@@ -2007,6 +2172,42 @@
           <w:sz w:val="26"/>
           <w:szCs w:val="26"/>
         </w:rPr>
+        <w:t xml:space="preserve">Emergência</w:t>
+      </w:r>
+    </w:p>
+    <w:p>
+      <w:pPr>
+        <w:spacing w:after="160" w:line="300"/>
+      </w:pPr>
+      <w:r>
+        <w:rPr>
+          <w:rFonts w:ascii="Consolas" w:cs="Consolas" w:eastAsia="Consolas" w:hAnsi="Consolas"/>
+          <w:color w:val="9AA0A6"/>
+          <w:sz w:val="14"/>
+          <w:szCs w:val="14"/>
+        </w:rPr>
+        <w:t xml:space="preserve">AE-0053  </w:t>
+      </w:r>
+      <w:r>
+        <w:rPr>
+          <w:sz w:val="22"/>
+          <w:szCs w:val="22"/>
+        </w:rPr>
+        <w:t xml:space="preserve">Tenha um botão de pânico ou celular sempre ao alcance. Cadastre vizinhos na discagem rápida. Deixe uma chave extra com alguém de confiança.</w:t>
+      </w:r>
+    </w:p>
+    <w:p>
+      <w:pPr>
+        <w:pStyle w:val="Heading2"/>
+        <w:spacing w:after="120" w:before="280"/>
+      </w:pPr>
+      <w:r>
+        <w:rPr>
+          <w:b/>
+          <w:bCs/>
+          <w:sz w:val="26"/>
+          <w:szCs w:val="26"/>
+        </w:rPr>
         <w:t xml:space="preserve">Evacuação</w:t>
       </w:r>
     </w:p>
@@ -2021,7 +2222,7 @@
           <w:sz w:val="14"/>
           <w:szCs w:val="14"/>
         </w:rPr>
-        <w:t xml:space="preserve">AE-0048  </w:t>
+        <w:t xml:space="preserve">AE-0054  </w:t>
       </w:r>
       <w:r>
         <w:rPr>
@@ -2059,7 +2260,7 @@
           <w:sz w:val="14"/>
           <w:szCs w:val="14"/>
         </w:rPr>
-        <w:t xml:space="preserve">AE-0049  </w:t>
+        <w:t xml:space="preserve">AE-0055  </w:t>
       </w:r>
       <w:r>
         <w:rPr>
@@ -2080,7 +2281,7 @@
           <w:sz w:val="14"/>
           <w:szCs w:val="14"/>
         </w:rPr>
-        <w:t xml:space="preserve">AE-0050  </w:t>
+        <w:t xml:space="preserve">AE-0056  </w:t>
       </w:r>
       <w:r>
         <w:rPr>
@@ -2101,7 +2302,7 @@
           <w:sz w:val="14"/>
           <w:szCs w:val="14"/>
         </w:rPr>
-        <w:t xml:space="preserve">AE-0051  </w:t>
+        <w:t xml:space="preserve">AE-0057  </w:t>
       </w:r>
       <w:r>
         <w:rPr>
@@ -2122,7 +2323,7 @@
           <w:sz w:val="14"/>
           <w:szCs w:val="14"/>
         </w:rPr>
-        <w:t xml:space="preserve">AE-0052  </w:t>
+        <w:t xml:space="preserve">AE-0058  </w:t>
       </w:r>
       <w:r>
         <w:rPr>
@@ -2143,7 +2344,7 @@
           <w:sz w:val="14"/>
           <w:szCs w:val="14"/>
         </w:rPr>
-        <w:t xml:space="preserve">AE-0053  </w:t>
+        <w:t xml:space="preserve">AE-0059  </w:t>
       </w:r>
       <w:r>
         <w:rPr>
@@ -2164,7 +2365,7 @@
           <w:sz w:val="14"/>
           <w:szCs w:val="14"/>
         </w:rPr>
-        <w:t xml:space="preserve">AE-0054  </w:t>
+        <w:t xml:space="preserve">AE-0060  </w:t>
       </w:r>
       <w:r>
         <w:rPr>
@@ -2185,7 +2386,7 @@
           <w:sz w:val="14"/>
           <w:szCs w:val="14"/>
         </w:rPr>
-        <w:t xml:space="preserve">AE-0055  </w:t>
+        <w:t xml:space="preserve">AE-0061  </w:t>
       </w:r>
       <w:r>
         <w:rPr>
@@ -2206,7 +2407,7 @@
           <w:sz w:val="14"/>
           <w:szCs w:val="14"/>
         </w:rPr>
-        <w:t xml:space="preserve">AE-0056  </w:t>
+        <w:t xml:space="preserve">AE-0062  </w:t>
       </w:r>
       <w:r>
         <w:rPr>
@@ -2227,7 +2428,7 @@
           <w:sz w:val="14"/>
           <w:szCs w:val="14"/>
         </w:rPr>
-        <w:t xml:space="preserve">AE-0057  </w:t>
+        <w:t xml:space="preserve">AE-0063  </w:t>
       </w:r>
       <w:r>
         <w:rPr>
@@ -2248,7 +2449,7 @@
           <w:sz w:val="14"/>
           <w:szCs w:val="14"/>
         </w:rPr>
-        <w:t xml:space="preserve">AE-0058  </w:t>
+        <w:t xml:space="preserve">AE-0064  </w:t>
       </w:r>
       <w:r>
         <w:rPr>
@@ -2269,7 +2470,7 @@
           <w:sz w:val="14"/>
           <w:szCs w:val="14"/>
         </w:rPr>
-        <w:t xml:space="preserve">AE-0059  </w:t>
+        <w:t xml:space="preserve">AE-0065  </w:t>
       </w:r>
       <w:r>
         <w:rPr>
@@ -2290,7 +2491,7 @@
           <w:sz w:val="14"/>
           <w:szCs w:val="14"/>
         </w:rPr>
-        <w:t xml:space="preserve">AE-0060  </w:t>
+        <w:t xml:space="preserve">AE-0066  </w:t>
       </w:r>
       <w:r>
         <w:rPr>
@@ -2311,7 +2512,7 @@
           <w:sz w:val="14"/>
           <w:szCs w:val="14"/>
         </w:rPr>
-        <w:t xml:space="preserve">AE-0061  </w:t>
+        <w:t xml:space="preserve">AE-0067  </w:t>
       </w:r>
       <w:r>
         <w:rPr>
@@ -2332,7 +2533,7 @@
           <w:sz w:val="14"/>
           <w:szCs w:val="14"/>
         </w:rPr>
-        <w:t xml:space="preserve">AE-0062  </w:t>
+        <w:t xml:space="preserve">AE-0068  </w:t>
       </w:r>
       <w:r>
         <w:rPr>
@@ -2353,7 +2554,7 @@
           <w:sz w:val="14"/>
           <w:szCs w:val="14"/>
         </w:rPr>
-        <w:t xml:space="preserve">AE-0063  </w:t>
+        <w:t xml:space="preserve">AE-0069  </w:t>
       </w:r>
       <w:r>
         <w:rPr>
@@ -2374,7 +2575,7 @@
           <w:sz w:val="14"/>
           <w:szCs w:val="14"/>
         </w:rPr>
-        <w:t xml:space="preserve">AE-0064  </w:t>
+        <w:t xml:space="preserve">AE-0070  </w:t>
       </w:r>
       <w:r>
         <w:rPr>
@@ -2395,7 +2596,7 @@
           <w:sz w:val="14"/>
           <w:szCs w:val="14"/>
         </w:rPr>
-        <w:t xml:space="preserve">AE-0065  </w:t>
+        <w:t xml:space="preserve">AE-0071  </w:t>
       </w:r>
       <w:r>
         <w:rPr>
@@ -2416,7 +2617,7 @@
           <w:sz w:val="14"/>
           <w:szCs w:val="14"/>
         </w:rPr>
-        <w:t xml:space="preserve">AE-0066  </w:t>
+        <w:t xml:space="preserve">AE-0072  </w:t>
       </w:r>
       <w:r>
         <w:rPr>
@@ -2437,7 +2638,7 @@
           <w:sz w:val="14"/>
           <w:szCs w:val="14"/>
         </w:rPr>
-        <w:t xml:space="preserve">AE-0067  </w:t>
+        <w:t xml:space="preserve">AE-0073  </w:t>
       </w:r>
       <w:r>
         <w:rPr>
@@ -2458,7 +2659,7 @@
           <w:sz w:val="14"/>
           <w:szCs w:val="14"/>
         </w:rPr>
-        <w:t xml:space="preserve">AE-0068  </w:t>
+        <w:t xml:space="preserve">AE-0074  </w:t>
       </w:r>
       <w:r>
         <w:rPr>
@@ -2479,7 +2680,7 @@
           <w:sz w:val="14"/>
           <w:szCs w:val="14"/>
         </w:rPr>
-        <w:t xml:space="preserve">AE-0069  </w:t>
+        <w:t xml:space="preserve">AE-0075  </w:t>
       </w:r>
       <w:r>
         <w:rPr>
@@ -2500,7 +2701,7 @@
           <w:sz w:val="14"/>
           <w:szCs w:val="14"/>
         </w:rPr>
-        <w:t xml:space="preserve">AE-0070  </w:t>
+        <w:t xml:space="preserve">AE-0076  </w:t>
       </w:r>
       <w:r>
         <w:rPr>
@@ -2521,7 +2722,7 @@
           <w:sz w:val="14"/>
           <w:szCs w:val="14"/>
         </w:rPr>
-        <w:t xml:space="preserve">AE-0071  </w:t>
+        <w:t xml:space="preserve">AE-0077  </w:t>
       </w:r>
       <w:r>
         <w:rPr>
@@ -2542,7 +2743,7 @@
           <w:sz w:val="14"/>
           <w:szCs w:val="14"/>
         </w:rPr>
-        <w:t xml:space="preserve">AE-0072  </w:t>
+        <w:t xml:space="preserve">AE-0078  </w:t>
       </w:r>
       <w:r>
         <w:rPr>
@@ -2563,7 +2764,7 @@
           <w:sz w:val="14"/>
           <w:szCs w:val="14"/>
         </w:rPr>
-        <w:t xml:space="preserve">AE-0073  </w:t>
+        <w:t xml:space="preserve">AE-0079  </w:t>
       </w:r>
       <w:r>
         <w:rPr>
@@ -2584,7 +2785,7 @@
           <w:sz w:val="14"/>
           <w:szCs w:val="14"/>
         </w:rPr>
-        <w:t xml:space="preserve">AE-0074  </w:t>
+        <w:t xml:space="preserve">AE-0080  </w:t>
       </w:r>
       <w:r>
         <w:rPr>
@@ -2605,7 +2806,7 @@
           <w:sz w:val="14"/>
           <w:szCs w:val="14"/>
         </w:rPr>
-        <w:t xml:space="preserve">AE-0075  </w:t>
+        <w:t xml:space="preserve">AE-0081  </w:t>
       </w:r>
       <w:r>
         <w:rPr>
@@ -2626,7 +2827,7 @@
           <w:sz w:val="14"/>
           <w:szCs w:val="14"/>
         </w:rPr>
-        <w:t xml:space="preserve">AE-0076  </w:t>
+        <w:t xml:space="preserve">AE-0082  </w:t>
       </w:r>
       <w:r>
         <w:rPr>
@@ -2647,7 +2848,7 @@
           <w:sz w:val="14"/>
           <w:szCs w:val="14"/>
         </w:rPr>
-        <w:t xml:space="preserve">AE-0077  </w:t>
+        <w:t xml:space="preserve">AE-0083  </w:t>
       </w:r>
       <w:r>
         <w:rPr>
@@ -2668,7 +2869,7 @@
           <w:sz w:val="14"/>
           <w:szCs w:val="14"/>
         </w:rPr>
-        <w:t xml:space="preserve">AE-0078  </w:t>
+        <w:t xml:space="preserve">AE-0084  </w:t>
       </w:r>
       <w:r>
         <w:rPr>
@@ -2689,7 +2890,7 @@
           <w:sz w:val="14"/>
           <w:szCs w:val="14"/>
         </w:rPr>
-        <w:t xml:space="preserve">AE-0079  </w:t>
+        <w:t xml:space="preserve">AE-0085  </w:t>
       </w:r>
       <w:r>
         <w:rPr>
@@ -2710,7 +2911,7 @@
           <w:sz w:val="14"/>
           <w:szCs w:val="14"/>
         </w:rPr>
-        <w:t xml:space="preserve">AE-0080  </w:t>
+        <w:t xml:space="preserve">AE-0086  </w:t>
       </w:r>
       <w:r>
         <w:rPr>
@@ -2731,7 +2932,7 @@
           <w:sz w:val="14"/>
           <w:szCs w:val="14"/>
         </w:rPr>
-        <w:t xml:space="preserve">AE-0081  </w:t>
+        <w:t xml:space="preserve">AE-0087  </w:t>
       </w:r>
       <w:r>
         <w:rPr>
@@ -2752,7 +2953,7 @@
           <w:sz w:val="14"/>
           <w:szCs w:val="14"/>
         </w:rPr>
-        <w:t xml:space="preserve">AE-0082  </w:t>
+        <w:t xml:space="preserve">AE-0088  </w:t>
       </w:r>
       <w:r>
         <w:rPr>
@@ -2773,7 +2974,7 @@
           <w:sz w:val="14"/>
           <w:szCs w:val="14"/>
         </w:rPr>
-        <w:t xml:space="preserve">AE-0083  </w:t>
+        <w:t xml:space="preserve">AE-0089  </w:t>
       </w:r>
       <w:r>
         <w:rPr>
@@ -2794,7 +2995,7 @@
           <w:sz w:val="14"/>
           <w:szCs w:val="14"/>
         </w:rPr>
-        <w:t xml:space="preserve">AE-0084  </w:t>
+        <w:t xml:space="preserve">AE-0090  </w:t>
       </w:r>
       <w:r>
         <w:rPr>
@@ -2815,7 +3016,7 @@
           <w:sz w:val="14"/>
           <w:szCs w:val="14"/>
         </w:rPr>
-        <w:t xml:space="preserve">AE-0085  </w:t>
+        <w:t xml:space="preserve">AE-0091  </w:t>
       </w:r>
       <w:r>
         <w:rPr>
@@ -2836,7 +3037,7 @@
           <w:sz w:val="14"/>
           <w:szCs w:val="14"/>
         </w:rPr>
-        <w:t xml:space="preserve">AE-0086  </w:t>
+        <w:t xml:space="preserve">AE-0092  </w:t>
       </w:r>
       <w:r>
         <w:rPr>
@@ -2857,7 +3058,7 @@
           <w:sz w:val="14"/>
           <w:szCs w:val="14"/>
         </w:rPr>
-        <w:t xml:space="preserve">AE-0087  </w:t>
+        <w:t xml:space="preserve">AE-0093  </w:t>
       </w:r>
       <w:r>
         <w:rPr>
@@ -2878,7 +3079,7 @@
           <w:sz w:val="14"/>
           <w:szCs w:val="14"/>
         </w:rPr>
-        <w:t xml:space="preserve">AE-0088  </w:t>
+        <w:t xml:space="preserve">AE-0094  </w:t>
       </w:r>
       <w:r>
         <w:rPr>
@@ -2899,7 +3100,7 @@
           <w:sz w:val="14"/>
           <w:szCs w:val="14"/>
         </w:rPr>
-        <w:t xml:space="preserve">AE-0089  </w:t>
+        <w:t xml:space="preserve">AE-0095  </w:t>
       </w:r>
       <w:r>
         <w:rPr>
@@ -2920,7 +3121,7 @@
           <w:sz w:val="14"/>
           <w:szCs w:val="14"/>
         </w:rPr>
-        <w:t xml:space="preserve">AE-0090  </w:t>
+        <w:t xml:space="preserve">AE-0096  </w:t>
       </w:r>
       <w:r>
         <w:rPr>
@@ -2941,7 +3142,7 @@
           <w:sz w:val="14"/>
           <w:szCs w:val="14"/>
         </w:rPr>
-        <w:t xml:space="preserve">AE-0091  </w:t>
+        <w:t xml:space="preserve">AE-0097  </w:t>
       </w:r>
       <w:r>
         <w:rPr>
@@ -2979,7 +3180,7 @@
           <w:sz w:val="14"/>
           <w:szCs w:val="14"/>
         </w:rPr>
-        <w:t xml:space="preserve">AE-0092  </w:t>
+        <w:t xml:space="preserve">AE-0098  </w:t>
       </w:r>
       <w:r>
         <w:rPr>
@@ -3000,7 +3201,7 @@
           <w:sz w:val="14"/>
           <w:szCs w:val="14"/>
         </w:rPr>
-        <w:t xml:space="preserve">AE-0093  </w:t>
+        <w:t xml:space="preserve">AE-0099  </w:t>
       </w:r>
       <w:r>
         <w:rPr>
@@ -3021,7 +3222,7 @@
           <w:sz w:val="14"/>
           <w:szCs w:val="14"/>
         </w:rPr>
-        <w:t xml:space="preserve">AE-0094  </w:t>
+        <w:t xml:space="preserve">AE-0100  </w:t>
       </w:r>
       <w:r>
         <w:rPr>
@@ -3042,7 +3243,7 @@
           <w:sz w:val="14"/>
           <w:szCs w:val="14"/>
         </w:rPr>
-        <w:t xml:space="preserve">AE-0095  </w:t>
+        <w:t xml:space="preserve">AE-0101  </w:t>
       </w:r>
       <w:r>
         <w:rPr>
@@ -3063,7 +3264,7 @@
           <w:sz w:val="14"/>
           <w:szCs w:val="14"/>
         </w:rPr>
-        <w:t xml:space="preserve">AE-0096  </w:t>
+        <w:t xml:space="preserve">AE-0102  </w:t>
       </w:r>
       <w:r>
         <w:rPr>
@@ -3084,7 +3285,7 @@
           <w:sz w:val="14"/>
           <w:szCs w:val="14"/>
         </w:rPr>
-        <w:t xml:space="preserve">AE-0097  </w:t>
+        <w:t xml:space="preserve">AE-0103  </w:t>
       </w:r>
       <w:r>
         <w:rPr>
@@ -3105,7 +3306,7 @@
           <w:sz w:val="14"/>
           <w:szCs w:val="14"/>
         </w:rPr>
-        <w:t xml:space="preserve">AE-0098  </w:t>
+        <w:t xml:space="preserve">AE-0104  </w:t>
       </w:r>
       <w:r>
         <w:rPr>
@@ -3126,7 +3327,7 @@
           <w:sz w:val="14"/>
           <w:szCs w:val="14"/>
         </w:rPr>
-        <w:t xml:space="preserve">AE-0099  </w:t>
+        <w:t xml:space="preserve">AE-0105  </w:t>
       </w:r>
       <w:r>
         <w:rPr>
@@ -3147,7 +3348,7 @@
           <w:sz w:val="14"/>
           <w:szCs w:val="14"/>
         </w:rPr>
-        <w:t xml:space="preserve">AE-0100  </w:t>
+        <w:t xml:space="preserve">AE-0106  </w:t>
       </w:r>
       <w:r>
         <w:rPr>
@@ -3168,7 +3369,7 @@
           <w:sz w:val="14"/>
           <w:szCs w:val="14"/>
         </w:rPr>
-        <w:t xml:space="preserve">AE-0101  </w:t>
+        <w:t xml:space="preserve">AE-0107  </w:t>
       </w:r>
       <w:r>
         <w:rPr>
@@ -3189,7 +3390,7 @@
           <w:sz w:val="14"/>
           <w:szCs w:val="14"/>
         </w:rPr>
-        <w:t xml:space="preserve">AE-0102  </w:t>
+        <w:t xml:space="preserve">AE-0108  </w:t>
       </w:r>
       <w:r>
         <w:rPr>
@@ -3210,7 +3411,7 @@
           <w:sz w:val="14"/>
           <w:szCs w:val="14"/>
         </w:rPr>
-        <w:t xml:space="preserve">AE-0103  </w:t>
+        <w:t xml:space="preserve">AE-0109  </w:t>
       </w:r>
       <w:r>
         <w:rPr>
@@ -3231,7 +3432,7 @@
           <w:sz w:val="14"/>
           <w:szCs w:val="14"/>
         </w:rPr>
-        <w:t xml:space="preserve">AE-0104  </w:t>
+        <w:t xml:space="preserve">AE-0110  </w:t>
       </w:r>
       <w:r>
         <w:rPr>
@@ -3252,7 +3453,7 @@
           <w:sz w:val="14"/>
           <w:szCs w:val="14"/>
         </w:rPr>
-        <w:t xml:space="preserve">AE-0105  </w:t>
+        <w:t xml:space="preserve">AE-0111  </w:t>
       </w:r>
       <w:r>
         <w:rPr>
@@ -3273,7 +3474,7 @@
           <w:sz w:val="14"/>
           <w:szCs w:val="14"/>
         </w:rPr>
-        <w:t xml:space="preserve">AE-0106  </w:t>
+        <w:t xml:space="preserve">AE-0112  </w:t>
       </w:r>
       <w:r>
         <w:rPr>
@@ -3294,7 +3495,7 @@
           <w:sz w:val="14"/>
           <w:szCs w:val="14"/>
         </w:rPr>
-        <w:t xml:space="preserve">AE-0107  </w:t>
+        <w:t xml:space="preserve">AE-0113  </w:t>
       </w:r>
       <w:r>
         <w:rPr>
@@ -3315,7 +3516,7 @@
           <w:sz w:val="14"/>
           <w:szCs w:val="14"/>
         </w:rPr>
-        <w:t xml:space="preserve">AE-0108  </w:t>
+        <w:t xml:space="preserve">AE-0114  </w:t>
       </w:r>
       <w:r>
         <w:rPr>
@@ -3336,7 +3537,7 @@
           <w:sz w:val="14"/>
           <w:szCs w:val="14"/>
         </w:rPr>
-        <w:t xml:space="preserve">AE-0109  </w:t>
+        <w:t xml:space="preserve">AE-0115  </w:t>
       </w:r>
       <w:r>
         <w:rPr>
@@ -3357,7 +3558,7 @@
           <w:sz w:val="14"/>
           <w:szCs w:val="14"/>
         </w:rPr>
-        <w:t xml:space="preserve">AE-0110  </w:t>
+        <w:t xml:space="preserve">AE-0116  </w:t>
       </w:r>
       <w:r>
         <w:rPr>
@@ -3378,7 +3579,7 @@
           <w:sz w:val="14"/>
           <w:szCs w:val="14"/>
         </w:rPr>
-        <w:t xml:space="preserve">AE-0111  </w:t>
+        <w:t xml:space="preserve">AE-0117  </w:t>
       </w:r>
       <w:r>
         <w:rPr>
@@ -3399,7 +3600,7 @@
           <w:sz w:val="14"/>
           <w:szCs w:val="14"/>
         </w:rPr>
-        <w:t xml:space="preserve">AE-0112  </w:t>
+        <w:t xml:space="preserve">AE-0118  </w:t>
       </w:r>
       <w:r>
         <w:rPr>
@@ -3420,7 +3621,7 @@
           <w:sz w:val="14"/>
           <w:szCs w:val="14"/>
         </w:rPr>
-        <w:t xml:space="preserve">AE-0113  </w:t>
+        <w:t xml:space="preserve">AE-0119  </w:t>
       </w:r>
       <w:r>
         <w:rPr>
@@ -3441,7 +3642,7 @@
           <w:sz w:val="14"/>
           <w:szCs w:val="14"/>
         </w:rPr>
-        <w:t xml:space="preserve">AE-0114  </w:t>
+        <w:t xml:space="preserve">AE-0120  </w:t>
       </w:r>
       <w:r>
         <w:rPr>
@@ -3462,7 +3663,7 @@
           <w:sz w:val="14"/>
           <w:szCs w:val="14"/>
         </w:rPr>
-        <w:t xml:space="preserve">AE-0115  </w:t>
+        <w:t xml:space="preserve">AE-0121  </w:t>
       </w:r>
       <w:r>
         <w:rPr>
@@ -3483,7 +3684,7 @@
           <w:sz w:val="14"/>
           <w:szCs w:val="14"/>
         </w:rPr>
-        <w:t xml:space="preserve">AE-0116  </w:t>
+        <w:t xml:space="preserve">AE-0122  </w:t>
       </w:r>
       <w:r>
         <w:rPr>
@@ -3504,7 +3705,7 @@
           <w:sz w:val="14"/>
           <w:szCs w:val="14"/>
         </w:rPr>
-        <w:t xml:space="preserve">AE-0117  </w:t>
+        <w:t xml:space="preserve">AE-0123  </w:t>
       </w:r>
       <w:r>
         <w:rPr>
@@ -3525,7 +3726,7 @@
           <w:sz w:val="14"/>
           <w:szCs w:val="14"/>
         </w:rPr>
-        <w:t xml:space="preserve">AE-0118  </w:t>
+        <w:t xml:space="preserve">AE-0124  </w:t>
       </w:r>
       <w:r>
         <w:rPr>
@@ -3546,7 +3747,7 @@
           <w:sz w:val="14"/>
           <w:szCs w:val="14"/>
         </w:rPr>
-        <w:t xml:space="preserve">AE-0119  </w:t>
+        <w:t xml:space="preserve">AE-0125  </w:t>
       </w:r>
       <w:r>
         <w:rPr>
@@ -3567,7 +3768,7 @@
           <w:sz w:val="14"/>
           <w:szCs w:val="14"/>
         </w:rPr>
-        <w:t xml:space="preserve">AE-0120  </w:t>
+        <w:t xml:space="preserve">AE-0126  </w:t>
       </w:r>
       <w:r>
         <w:rPr>
@@ -3588,7 +3789,7 @@
           <w:sz w:val="14"/>
           <w:szCs w:val="14"/>
         </w:rPr>
-        <w:t xml:space="preserve">AE-0121  </w:t>
+        <w:t xml:space="preserve">AE-0127  </w:t>
       </w:r>
       <w:r>
         <w:rPr>
@@ -3609,7 +3810,7 @@
           <w:sz w:val="14"/>
           <w:szCs w:val="14"/>
         </w:rPr>
-        <w:t xml:space="preserve">AE-0122  </w:t>
+        <w:t xml:space="preserve">AE-0128  </w:t>
       </w:r>
       <w:r>
         <w:rPr>
@@ -3630,7 +3831,7 @@
           <w:sz w:val="14"/>
           <w:szCs w:val="14"/>
         </w:rPr>
-        <w:t xml:space="preserve">AE-0123  </w:t>
+        <w:t xml:space="preserve">AE-0129  </w:t>
       </w:r>
       <w:r>
         <w:rPr>
@@ -3651,7 +3852,7 @@
           <w:sz w:val="14"/>
           <w:szCs w:val="14"/>
         </w:rPr>
-        <w:t xml:space="preserve">AE-0124  </w:t>
+        <w:t xml:space="preserve">AE-0130  </w:t>
       </w:r>
       <w:r>
         <w:rPr>
@@ -3672,7 +3873,7 @@
           <w:sz w:val="14"/>
           <w:szCs w:val="14"/>
         </w:rPr>
-        <w:t xml:space="preserve">AE-0125  </w:t>
+        <w:t xml:space="preserve">AE-0131  </w:t>
       </w:r>
       <w:r>
         <w:rPr>
@@ -3693,7 +3894,7 @@
           <w:sz w:val="14"/>
           <w:szCs w:val="14"/>
         </w:rPr>
-        <w:t xml:space="preserve">AE-0126  </w:t>
+        <w:t xml:space="preserve">AE-0132  </w:t>
       </w:r>
       <w:r>
         <w:rPr>
@@ -3714,7 +3915,7 @@
           <w:sz w:val="14"/>
           <w:szCs w:val="14"/>
         </w:rPr>
-        <w:t xml:space="preserve">AE-0127  </w:t>
+        <w:t xml:space="preserve">AE-0133  </w:t>
       </w:r>
       <w:r>
         <w:rPr>
@@ -3735,7 +3936,7 @@
           <w:sz w:val="14"/>
           <w:szCs w:val="14"/>
         </w:rPr>
-        <w:t xml:space="preserve">AE-0128  </w:t>
+        <w:t xml:space="preserve">AE-0134  </w:t>
       </w:r>
       <w:r>
         <w:rPr>
@@ -3756,7 +3957,7 @@
           <w:sz w:val="14"/>
           <w:szCs w:val="14"/>
         </w:rPr>
-        <w:t xml:space="preserve">AE-0129  </w:t>
+        <w:t xml:space="preserve">AE-0135  </w:t>
       </w:r>
       <w:r>
         <w:rPr>
@@ -3777,7 +3978,7 @@
           <w:sz w:val="14"/>
           <w:szCs w:val="14"/>
         </w:rPr>
-        <w:t xml:space="preserve">AE-0130  </w:t>
+        <w:t xml:space="preserve">AE-0136  </w:t>
       </w:r>
       <w:r>
         <w:rPr>
@@ -3798,7 +3999,7 @@
           <w:sz w:val="14"/>
           <w:szCs w:val="14"/>
         </w:rPr>
-        <w:t xml:space="preserve">AE-0131  </w:t>
+        <w:t xml:space="preserve">AE-0137  </w:t>
       </w:r>
       <w:r>
         <w:rPr>
@@ -3819,7 +4020,7 @@
           <w:sz w:val="14"/>
           <w:szCs w:val="14"/>
         </w:rPr>
-        <w:t xml:space="preserve">AE-0132  </w:t>
+        <w:t xml:space="preserve">AE-0138  </w:t>
       </w:r>
       <w:r>
         <w:rPr>
@@ -3840,7 +4041,7 @@
           <w:sz w:val="14"/>
           <w:szCs w:val="14"/>
         </w:rPr>
-        <w:t xml:space="preserve">AE-0133  </w:t>
+        <w:t xml:space="preserve">AE-0139  </w:t>
       </w:r>
       <w:r>
         <w:rPr>
@@ -3861,7 +4062,7 @@
           <w:sz w:val="14"/>
           <w:szCs w:val="14"/>
         </w:rPr>
-        <w:t xml:space="preserve">AE-0134  </w:t>
+        <w:t xml:space="preserve">AE-0140  </w:t>
       </w:r>
       <w:r>
         <w:rPr>
@@ -3882,7 +4083,7 @@
           <w:sz w:val="14"/>
           <w:szCs w:val="14"/>
         </w:rPr>
-        <w:t xml:space="preserve">AE-0135  </w:t>
+        <w:t xml:space="preserve">AE-0141  </w:t>
       </w:r>
       <w:r>
         <w:rPr>
@@ -3903,7 +4104,7 @@
           <w:sz w:val="14"/>
           <w:szCs w:val="14"/>
         </w:rPr>
-        <w:t xml:space="preserve">AE-0136  </w:t>
+        <w:t xml:space="preserve">AE-0142  </w:t>
       </w:r>
       <w:r>
         <w:rPr>
@@ -3924,7 +4125,7 @@
           <w:sz w:val="14"/>
           <w:szCs w:val="14"/>
         </w:rPr>
-        <w:t xml:space="preserve">AE-0137  </w:t>
+        <w:t xml:space="preserve">AE-0143  </w:t>
       </w:r>
       <w:r>
         <w:rPr>
@@ -3945,7 +4146,7 @@
           <w:sz w:val="14"/>
           <w:szCs w:val="14"/>
         </w:rPr>
-        <w:t xml:space="preserve">AE-0138  </w:t>
+        <w:t xml:space="preserve">AE-0144  </w:t>
       </w:r>
       <w:r>
         <w:rPr>
@@ -3966,7 +4167,7 @@
           <w:sz w:val="14"/>
           <w:szCs w:val="14"/>
         </w:rPr>
-        <w:t xml:space="preserve">AE-0139  </w:t>
+        <w:t xml:space="preserve">AE-0145  </w:t>
       </w:r>
       <w:r>
         <w:rPr>
@@ -3987,7 +4188,7 @@
           <w:sz w:val="14"/>
           <w:szCs w:val="14"/>
         </w:rPr>
-        <w:t xml:space="preserve">AE-0140  </w:t>
+        <w:t xml:space="preserve">AE-0146  </w:t>
       </w:r>
       <w:r>
         <w:rPr>
@@ -4008,7 +4209,7 @@
           <w:sz w:val="14"/>
           <w:szCs w:val="14"/>
         </w:rPr>
-        <w:t xml:space="preserve">AE-0141  </w:t>
+        <w:t xml:space="preserve">AE-0147  </w:t>
       </w:r>
       <w:r>
         <w:rPr>
@@ -4029,7 +4230,7 @@
           <w:sz w:val="14"/>
           <w:szCs w:val="14"/>
         </w:rPr>
-        <w:t xml:space="preserve">AE-0142  </w:t>
+        <w:t xml:space="preserve">AE-0148  </w:t>
       </w:r>
       <w:r>
         <w:rPr>
@@ -4050,7 +4251,7 @@
           <w:sz w:val="14"/>
           <w:szCs w:val="14"/>
         </w:rPr>
-        <w:t xml:space="preserve">AE-0143  </w:t>
+        <w:t xml:space="preserve">AE-0149  </w:t>
       </w:r>
       <w:r>
         <w:rPr>
@@ -4071,7 +4272,7 @@
           <w:sz w:val="14"/>
           <w:szCs w:val="14"/>
         </w:rPr>
-        <w:t xml:space="preserve">AE-0144  </w:t>
+        <w:t xml:space="preserve">AE-0150  </w:t>
       </w:r>
       <w:r>
         <w:rPr>
@@ -4092,7 +4293,7 @@
           <w:sz w:val="14"/>
           <w:szCs w:val="14"/>
         </w:rPr>
-        <w:t xml:space="preserve">AE-0145  </w:t>
+        <w:t xml:space="preserve">AE-0151  </w:t>
       </w:r>
       <w:r>
         <w:rPr>
@@ -4113,7 +4314,7 @@
           <w:sz w:val="14"/>
           <w:szCs w:val="14"/>
         </w:rPr>
-        <w:t xml:space="preserve">AE-0146  </w:t>
+        <w:t xml:space="preserve">AE-0152  </w:t>
       </w:r>
       <w:r>
         <w:rPr>
@@ -4134,7 +4335,7 @@
           <w:sz w:val="14"/>
           <w:szCs w:val="14"/>
         </w:rPr>
-        <w:t xml:space="preserve">AE-0147  </w:t>
+        <w:t xml:space="preserve">AE-0153  </w:t>
       </w:r>
       <w:r>
         <w:rPr>
@@ -4155,7 +4356,7 @@
           <w:sz w:val="14"/>
           <w:szCs w:val="14"/>
         </w:rPr>
-        <w:t xml:space="preserve">AE-0148  </w:t>
+        <w:t xml:space="preserve">AE-0154  </w:t>
       </w:r>
       <w:r>
         <w:rPr>
@@ -4176,7 +4377,7 @@
           <w:sz w:val="14"/>
           <w:szCs w:val="14"/>
         </w:rPr>
-        <w:t xml:space="preserve">AE-0149  </w:t>
+        <w:t xml:space="preserve">AE-0155  </w:t>
       </w:r>
       <w:r>
         <w:rPr>
@@ -4197,7 +4398,7 @@
           <w:sz w:val="14"/>
           <w:szCs w:val="14"/>
         </w:rPr>
-        <w:t xml:space="preserve">AE-0150  </w:t>
+        <w:t xml:space="preserve">AE-0156  </w:t>
       </w:r>
       <w:r>
         <w:rPr>
@@ -4218,7 +4419,7 @@
           <w:sz w:val="14"/>
           <w:szCs w:val="14"/>
         </w:rPr>
-        <w:t xml:space="preserve">AE-0151  </w:t>
+        <w:t xml:space="preserve">AE-0157  </w:t>
       </w:r>
       <w:r>
         <w:rPr>
@@ -4239,7 +4440,7 @@
           <w:sz w:val="14"/>
           <w:szCs w:val="14"/>
         </w:rPr>
-        <w:t xml:space="preserve">AE-0152  </w:t>
+        <w:t xml:space="preserve">AE-0158  </w:t>
       </w:r>
       <w:r>
         <w:rPr>
@@ -4260,7 +4461,7 @@
           <w:sz w:val="14"/>
           <w:szCs w:val="14"/>
         </w:rPr>
-        <w:t xml:space="preserve">AE-0153  </w:t>
+        <w:t xml:space="preserve">AE-0159  </w:t>
       </w:r>
       <w:r>
         <w:rPr>
@@ -4281,7 +4482,7 @@
           <w:sz w:val="14"/>
           <w:szCs w:val="14"/>
         </w:rPr>
-        <w:t xml:space="preserve">AE-0154  </w:t>
+        <w:t xml:space="preserve">AE-0160  </w:t>
       </w:r>
       <w:r>
         <w:rPr>
@@ -4302,7 +4503,7 @@
           <w:sz w:val="14"/>
           <w:szCs w:val="14"/>
         </w:rPr>
-        <w:t xml:space="preserve">AE-0155  </w:t>
+        <w:t xml:space="preserve">AE-0161  </w:t>
       </w:r>
       <w:r>
         <w:rPr>
@@ -4323,7 +4524,7 @@
           <w:sz w:val="14"/>
           <w:szCs w:val="14"/>
         </w:rPr>
-        <w:t xml:space="preserve">AE-0156  </w:t>
+        <w:t xml:space="preserve">AE-0162  </w:t>
       </w:r>
       <w:r>
         <w:rPr>
@@ -4344,7 +4545,7 @@
           <w:sz w:val="14"/>
           <w:szCs w:val="14"/>
         </w:rPr>
-        <w:t xml:space="preserve">AE-0157  </w:t>
+        <w:t xml:space="preserve">AE-0163  </w:t>
       </w:r>
       <w:r>
         <w:rPr>
@@ -4413,7 +4614,7 @@
           <w:sz w:val="14"/>
           <w:szCs w:val="14"/>
         </w:rPr>
-        <w:t xml:space="preserve">AE-0158  </w:t>
+        <w:t xml:space="preserve">AE-0164  </w:t>
       </w:r>
       <w:r>
         <w:rPr>
@@ -4450,7 +4651,7 @@
           <w:sz w:val="14"/>
           <w:szCs w:val="14"/>
         </w:rPr>
-        <w:t xml:space="preserve">AE-0159  </w:t>
+        <w:t xml:space="preserve">AE-0165  </w:t>
       </w:r>
       <w:r>
         <w:rPr>
@@ -4471,7 +4672,7 @@
           <w:sz w:val="14"/>
           <w:szCs w:val="14"/>
         </w:rPr>
-        <w:t xml:space="preserve">AE-0160  </w:t>
+        <w:t xml:space="preserve">AE-0166  </w:t>
       </w:r>
       <w:r>
         <w:rPr>
@@ -4492,7 +4693,7 @@
           <w:sz w:val="14"/>
           <w:szCs w:val="14"/>
         </w:rPr>
-        <w:t xml:space="preserve">AE-0161  </w:t>
+        <w:t xml:space="preserve">AE-0167  </w:t>
       </w:r>
       <w:r>
         <w:rPr>
@@ -4513,7 +4714,7 @@
           <w:sz w:val="14"/>
           <w:szCs w:val="14"/>
         </w:rPr>
-        <w:t xml:space="preserve">AE-0162  </w:t>
+        <w:t xml:space="preserve">AE-0168  </w:t>
       </w:r>
       <w:r>
         <w:rPr>
@@ -4534,7 +4735,7 @@
           <w:sz w:val="14"/>
           <w:szCs w:val="14"/>
         </w:rPr>
-        <w:t xml:space="preserve">AE-0163  </w:t>
+        <w:t xml:space="preserve">AE-0169  </w:t>
       </w:r>
       <w:r>
         <w:rPr>
@@ -4555,7 +4756,7 @@
           <w:sz w:val="14"/>
           <w:szCs w:val="14"/>
         </w:rPr>
-        <w:t xml:space="preserve">AE-0164  </w:t>
+        <w:t xml:space="preserve">AE-0170  </w:t>
       </w:r>
       <w:r>
         <w:rPr>
@@ -4576,7 +4777,7 @@
           <w:sz w:val="14"/>
           <w:szCs w:val="14"/>
         </w:rPr>
-        <w:t xml:space="preserve">AE-0165  </w:t>
+        <w:t xml:space="preserve">AE-0171  </w:t>
       </w:r>
       <w:r>
         <w:rPr>
@@ -4597,7 +4798,7 @@
           <w:sz w:val="14"/>
           <w:szCs w:val="14"/>
         </w:rPr>
-        <w:t xml:space="preserve">AE-0166  </w:t>
+        <w:t xml:space="preserve">AE-0172  </w:t>
       </w:r>
       <w:r>
         <w:rPr>
@@ -4618,7 +4819,7 @@
           <w:sz w:val="14"/>
           <w:szCs w:val="14"/>
         </w:rPr>
-        <w:t xml:space="preserve">AE-0167  </w:t>
+        <w:t xml:space="preserve">AE-0173  </w:t>
       </w:r>
       <w:r>
         <w:rPr>
@@ -4639,7 +4840,7 @@
           <w:sz w:val="14"/>
           <w:szCs w:val="14"/>
         </w:rPr>
-        <w:t xml:space="preserve">AE-0168  </w:t>
+        <w:t xml:space="preserve">AE-0174  </w:t>
       </w:r>
       <w:r>
         <w:rPr>
@@ -4677,133 +4878,7 @@
           <w:sz w:val="16"/>
           <w:szCs w:val="16"/>
         </w:rPr>
-        <w:t xml:space="preserve">ITENS</w:t>
-      </w:r>
-    </w:p>
-    <w:p>
-      <w:pPr>
-        <w:spacing w:after="160" w:line="300"/>
-      </w:pPr>
-      <w:r>
-        <w:rPr>
-          <w:rFonts w:ascii="Consolas" w:cs="Consolas" w:eastAsia="Consolas" w:hAnsi="Consolas"/>
-          <w:color w:val="9AA0A6"/>
-          <w:sz w:val="14"/>
-          <w:szCs w:val="14"/>
-        </w:rPr>
-        <w:t xml:space="preserve">AE-0169  </w:t>
-      </w:r>
-      <w:r>
-        <w:rPr>
-          <w:sz w:val="22"/>
-          <w:szCs w:val="22"/>
-        </w:rPr>
-        <w:t xml:space="preserve">Band-aid de vários tamanhos</w:t>
-      </w:r>
-    </w:p>
-    <w:p>
-      <w:pPr>
-        <w:spacing w:after="160" w:line="300"/>
-      </w:pPr>
-      <w:r>
-        <w:rPr>
-          <w:rFonts w:ascii="Consolas" w:cs="Consolas" w:eastAsia="Consolas" w:hAnsi="Consolas"/>
-          <w:color w:val="9AA0A6"/>
-          <w:sz w:val="14"/>
-          <w:szCs w:val="14"/>
-        </w:rPr>
-        <w:t xml:space="preserve">AE-0170  </w:t>
-      </w:r>
-      <w:r>
-        <w:rPr>
-          <w:sz w:val="22"/>
-          <w:szCs w:val="22"/>
-        </w:rPr>
-        <w:t xml:space="preserve">Compressas de gaze esterilizadas</w:t>
-      </w:r>
-    </w:p>
-    <w:p>
-      <w:pPr>
-        <w:spacing w:after="160" w:line="300"/>
-      </w:pPr>
-      <w:r>
-        <w:rPr>
-          <w:rFonts w:ascii="Consolas" w:cs="Consolas" w:eastAsia="Consolas" w:hAnsi="Consolas"/>
-          <w:color w:val="9AA0A6"/>
-          <w:sz w:val="14"/>
-          <w:szCs w:val="14"/>
-        </w:rPr>
-        <w:t xml:space="preserve">AE-0171  </w:t>
-      </w:r>
-      <w:r>
-        <w:rPr>
-          <w:sz w:val="22"/>
-          <w:szCs w:val="22"/>
-        </w:rPr>
-        <w:t xml:space="preserve">Antisséptico (clorexidina ou iodopovidona)</w:t>
-      </w:r>
-    </w:p>
-    <w:p>
-      <w:pPr>
-        <w:spacing w:after="160" w:line="300"/>
-      </w:pPr>
-      <w:r>
-        <w:rPr>
-          <w:rFonts w:ascii="Consolas" w:cs="Consolas" w:eastAsia="Consolas" w:hAnsi="Consolas"/>
-          <w:color w:val="9AA0A6"/>
-          <w:sz w:val="14"/>
-          <w:szCs w:val="14"/>
-        </w:rPr>
-        <w:t xml:space="preserve">AE-0172  </w:t>
-      </w:r>
-      <w:r>
-        <w:rPr>
-          <w:sz w:val="22"/>
-          <w:szCs w:val="22"/>
-        </w:rPr>
-        <w:t xml:space="preserve">Álcool 70% em lenço ou spray</w:t>
-      </w:r>
-    </w:p>
-    <w:p>
-      <w:pPr>
-        <w:spacing w:after="160" w:line="300"/>
-      </w:pPr>
-      <w:r>
-        <w:rPr>
-          <w:rFonts w:ascii="Consolas" w:cs="Consolas" w:eastAsia="Consolas" w:hAnsi="Consolas"/>
-          <w:color w:val="9AA0A6"/>
-          <w:sz w:val="14"/>
-          <w:szCs w:val="14"/>
-        </w:rPr>
-        <w:t xml:space="preserve">AE-0173  </w:t>
-      </w:r>
-      <w:r>
-        <w:rPr>
-          <w:sz w:val="22"/>
-          <w:szCs w:val="22"/>
-        </w:rPr>
-        <w:t xml:space="preserve">Soro fisiológico para limpar ferimento</w:t>
-      </w:r>
-    </w:p>
-    <w:p>
-      <w:pPr>
-        <w:spacing w:after="160" w:line="300"/>
-      </w:pPr>
-      <w:r>
-        <w:rPr>
-          <w:rFonts w:ascii="Consolas" w:cs="Consolas" w:eastAsia="Consolas" w:hAnsi="Consolas"/>
-          <w:color w:val="9AA0A6"/>
-          <w:sz w:val="14"/>
-          <w:szCs w:val="14"/>
-        </w:rPr>
-        <w:t xml:space="preserve">AE-0174  </w:t>
-      </w:r>
-      <w:r>
-        <w:rPr>
-          <w:sz w:val="22"/>
-          <w:szCs w:val="22"/>
-        </w:rPr>
-        <w:t xml:space="preserve">Tesoura de pontas redondas</w:t>
+        <w:t xml:space="preserve">INTRODUCAO</w:t>
       </w:r>
     </w:p>
     <w:p>
@@ -4824,64 +4899,7 @@
           <w:sz w:val="22"/>
           <w:szCs w:val="22"/>
         </w:rPr>
-        <w:t xml:space="preserve">Pinça para farpa e espinho</w:t>
-      </w:r>
-    </w:p>
-    <w:p>
-      <w:pPr>
-        <w:spacing w:after="160" w:line="300"/>
-      </w:pPr>
-      <w:r>
-        <w:rPr>
-          <w:rFonts w:ascii="Consolas" w:cs="Consolas" w:eastAsia="Consolas" w:hAnsi="Consolas"/>
-          <w:color w:val="9AA0A6"/>
-          <w:sz w:val="14"/>
-          <w:szCs w:val="14"/>
-        </w:rPr>
-        <w:t xml:space="preserve">AE-0176  </w:t>
-      </w:r>
-      <w:r>
-        <w:rPr>
-          <w:sz w:val="22"/>
-          <w:szCs w:val="22"/>
-        </w:rPr>
-        <w:t xml:space="preserve">Pomada para queimadura leve</w:t>
-      </w:r>
-    </w:p>
-    <w:p>
-      <w:pPr>
-        <w:spacing w:after="160" w:line="300"/>
-      </w:pPr>
-      <w:r>
-        <w:rPr>
-          <w:rFonts w:ascii="Consolas" w:cs="Consolas" w:eastAsia="Consolas" w:hAnsi="Consolas"/>
-          <w:color w:val="9AA0A6"/>
-          <w:sz w:val="14"/>
-          <w:szCs w:val="14"/>
-        </w:rPr>
-        <w:t xml:space="preserve">AE-0177  </w:t>
-      </w:r>
-      <w:r>
-        <w:rPr>
-          <w:sz w:val="22"/>
-          <w:szCs w:val="22"/>
-        </w:rPr>
-        <w:t xml:space="preserve">Gel ou roll-on para picada de inseto</w:t>
-      </w:r>
-    </w:p>
-    <w:p>
-      <w:pPr>
-        <w:pStyle w:val="Heading2"/>
-        <w:spacing w:after="120" w:before="280"/>
-      </w:pPr>
-      <w:r>
-        <w:rPr>
-          <w:b/>
-          <w:bCs/>
-          <w:sz w:val="26"/>
-          <w:szCs w:val="26"/>
-        </w:rPr>
-        <w:t xml:space="preserve">Higiene e Proteção</w:t>
+        <w:t xml:space="preserve">Vale ainda mais se a viagem tem criança ou atividade ao ar livre.</w:t>
       </w:r>
     </w:p>
     <w:p>
@@ -4897,7 +4915,49 @@
           <w:sz w:val="16"/>
           <w:szCs w:val="16"/>
         </w:rPr>
-        <w:t xml:space="preserve">INTRODUCAO</w:t>
+        <w:t xml:space="preserve">ITENS</w:t>
+      </w:r>
+    </w:p>
+    <w:p>
+      <w:pPr>
+        <w:spacing w:after="160" w:line="300"/>
+      </w:pPr>
+      <w:r>
+        <w:rPr>
+          <w:rFonts w:ascii="Consolas" w:cs="Consolas" w:eastAsia="Consolas" w:hAnsi="Consolas"/>
+          <w:color w:val="9AA0A6"/>
+          <w:sz w:val="14"/>
+          <w:szCs w:val="14"/>
+        </w:rPr>
+        <w:t xml:space="preserve">AE-0176  </w:t>
+      </w:r>
+      <w:r>
+        <w:rPr>
+          <w:sz w:val="22"/>
+          <w:szCs w:val="22"/>
+        </w:rPr>
+        <w:t xml:space="preserve">Band-aid de vários tamanhos</w:t>
+      </w:r>
+    </w:p>
+    <w:p>
+      <w:pPr>
+        <w:spacing w:after="160" w:line="300"/>
+      </w:pPr>
+      <w:r>
+        <w:rPr>
+          <w:rFonts w:ascii="Consolas" w:cs="Consolas" w:eastAsia="Consolas" w:hAnsi="Consolas"/>
+          <w:color w:val="9AA0A6"/>
+          <w:sz w:val="14"/>
+          <w:szCs w:val="14"/>
+        </w:rPr>
+        <w:t xml:space="preserve">AE-0177  </w:t>
+      </w:r>
+      <w:r>
+        <w:rPr>
+          <w:sz w:val="22"/>
+          <w:szCs w:val="22"/>
+        </w:rPr>
+        <w:t xml:space="preserve">Compressas de gaze esterilizadas</w:t>
       </w:r>
     </w:p>
     <w:p>
@@ -4918,7 +4978,148 @@
           <w:sz w:val="22"/>
           <w:szCs w:val="22"/>
         </w:rPr>
-        <w:t xml:space="preserve">Higiene e proteção ambiental são prevenção — não são supérfluos de mala.</w:t>
+        <w:t xml:space="preserve">Antisséptico (clorexidina ou iodopovidona)</w:t>
+      </w:r>
+    </w:p>
+    <w:p>
+      <w:pPr>
+        <w:spacing w:after="160" w:line="300"/>
+      </w:pPr>
+      <w:r>
+        <w:rPr>
+          <w:rFonts w:ascii="Consolas" w:cs="Consolas" w:eastAsia="Consolas" w:hAnsi="Consolas"/>
+          <w:color w:val="9AA0A6"/>
+          <w:sz w:val="14"/>
+          <w:szCs w:val="14"/>
+        </w:rPr>
+        <w:t xml:space="preserve">AE-0179  </w:t>
+      </w:r>
+      <w:r>
+        <w:rPr>
+          <w:sz w:val="22"/>
+          <w:szCs w:val="22"/>
+        </w:rPr>
+        <w:t xml:space="preserve">Álcool 70% em lenço ou spray</w:t>
+      </w:r>
+    </w:p>
+    <w:p>
+      <w:pPr>
+        <w:spacing w:after="160" w:line="300"/>
+      </w:pPr>
+      <w:r>
+        <w:rPr>
+          <w:rFonts w:ascii="Consolas" w:cs="Consolas" w:eastAsia="Consolas" w:hAnsi="Consolas"/>
+          <w:color w:val="9AA0A6"/>
+          <w:sz w:val="14"/>
+          <w:szCs w:val="14"/>
+        </w:rPr>
+        <w:t xml:space="preserve">AE-0180  </w:t>
+      </w:r>
+      <w:r>
+        <w:rPr>
+          <w:sz w:val="22"/>
+          <w:szCs w:val="22"/>
+        </w:rPr>
+        <w:t xml:space="preserve">Soro fisiológico para limpar ferimento</w:t>
+      </w:r>
+    </w:p>
+    <w:p>
+      <w:pPr>
+        <w:spacing w:after="160" w:line="300"/>
+      </w:pPr>
+      <w:r>
+        <w:rPr>
+          <w:rFonts w:ascii="Consolas" w:cs="Consolas" w:eastAsia="Consolas" w:hAnsi="Consolas"/>
+          <w:color w:val="9AA0A6"/>
+          <w:sz w:val="14"/>
+          <w:szCs w:val="14"/>
+        </w:rPr>
+        <w:t xml:space="preserve">AE-0181  </w:t>
+      </w:r>
+      <w:r>
+        <w:rPr>
+          <w:sz w:val="22"/>
+          <w:szCs w:val="22"/>
+        </w:rPr>
+        <w:t xml:space="preserve">Tesoura de pontas redondas</w:t>
+      </w:r>
+    </w:p>
+    <w:p>
+      <w:pPr>
+        <w:spacing w:after="160" w:line="300"/>
+      </w:pPr>
+      <w:r>
+        <w:rPr>
+          <w:rFonts w:ascii="Consolas" w:cs="Consolas" w:eastAsia="Consolas" w:hAnsi="Consolas"/>
+          <w:color w:val="9AA0A6"/>
+          <w:sz w:val="14"/>
+          <w:szCs w:val="14"/>
+        </w:rPr>
+        <w:t xml:space="preserve">AE-0182  </w:t>
+      </w:r>
+      <w:r>
+        <w:rPr>
+          <w:sz w:val="22"/>
+          <w:szCs w:val="22"/>
+        </w:rPr>
+        <w:t xml:space="preserve">Pinça para farpa e espinho</w:t>
+      </w:r>
+    </w:p>
+    <w:p>
+      <w:pPr>
+        <w:spacing w:after="160" w:line="300"/>
+      </w:pPr>
+      <w:r>
+        <w:rPr>
+          <w:rFonts w:ascii="Consolas" w:cs="Consolas" w:eastAsia="Consolas" w:hAnsi="Consolas"/>
+          <w:color w:val="9AA0A6"/>
+          <w:sz w:val="14"/>
+          <w:szCs w:val="14"/>
+        </w:rPr>
+        <w:t xml:space="preserve">AE-0183  </w:t>
+      </w:r>
+      <w:r>
+        <w:rPr>
+          <w:sz w:val="22"/>
+          <w:szCs w:val="22"/>
+        </w:rPr>
+        <w:t xml:space="preserve">Pomada para queimadura leve</w:t>
+      </w:r>
+    </w:p>
+    <w:p>
+      <w:pPr>
+        <w:spacing w:after="160" w:line="300"/>
+      </w:pPr>
+      <w:r>
+        <w:rPr>
+          <w:rFonts w:ascii="Consolas" w:cs="Consolas" w:eastAsia="Consolas" w:hAnsi="Consolas"/>
+          <w:color w:val="9AA0A6"/>
+          <w:sz w:val="14"/>
+          <w:szCs w:val="14"/>
+        </w:rPr>
+        <w:t xml:space="preserve">AE-0184  </w:t>
+      </w:r>
+      <w:r>
+        <w:rPr>
+          <w:sz w:val="22"/>
+          <w:szCs w:val="22"/>
+        </w:rPr>
+        <w:t xml:space="preserve">Gel ou roll-on para picada de inseto</w:t>
+      </w:r>
+    </w:p>
+    <w:p>
+      <w:pPr>
+        <w:pStyle w:val="Heading2"/>
+        <w:spacing w:after="120" w:before="280"/>
+      </w:pPr>
+      <w:r>
+        <w:rPr>
+          <w:b/>
+          <w:bCs/>
+          <w:sz w:val="26"/>
+          <w:szCs w:val="26"/>
+        </w:rPr>
+        <w:t xml:space="preserve">Higiene e Proteção</w:t>
       </w:r>
     </w:p>
     <w:p>
@@ -4934,133 +5135,7 @@
           <w:sz w:val="16"/>
           <w:szCs w:val="16"/>
         </w:rPr>
-        <w:t xml:space="preserve">ITENS</w:t>
-      </w:r>
-    </w:p>
-    <w:p>
-      <w:pPr>
-        <w:spacing w:after="160" w:line="300"/>
-      </w:pPr>
-      <w:r>
-        <w:rPr>
-          <w:rFonts w:ascii="Consolas" w:cs="Consolas" w:eastAsia="Consolas" w:hAnsi="Consolas"/>
-          <w:color w:val="9AA0A6"/>
-          <w:sz w:val="14"/>
-          <w:szCs w:val="14"/>
-        </w:rPr>
-        <w:t xml:space="preserve">AE-0179  </w:t>
-      </w:r>
-      <w:r>
-        <w:rPr>
-          <w:sz w:val="22"/>
-          <w:szCs w:val="22"/>
-        </w:rPr>
-        <w:t xml:space="preserve">Escova, pasta e fio dental</w:t>
-      </w:r>
-    </w:p>
-    <w:p>
-      <w:pPr>
-        <w:spacing w:after="160" w:line="300"/>
-      </w:pPr>
-      <w:r>
-        <w:rPr>
-          <w:rFonts w:ascii="Consolas" w:cs="Consolas" w:eastAsia="Consolas" w:hAnsi="Consolas"/>
-          <w:color w:val="9AA0A6"/>
-          <w:sz w:val="14"/>
-          <w:szCs w:val="14"/>
-        </w:rPr>
-        <w:t xml:space="preserve">AE-0180  </w:t>
-      </w:r>
-      <w:r>
-        <w:rPr>
-          <w:sz w:val="22"/>
-          <w:szCs w:val="22"/>
-        </w:rPr>
-        <w:t xml:space="preserve">Sabonete e xampu em tamanho de viagem</w:t>
-      </w:r>
-    </w:p>
-    <w:p>
-      <w:pPr>
-        <w:spacing w:after="160" w:line="300"/>
-      </w:pPr>
-      <w:r>
-        <w:rPr>
-          <w:rFonts w:ascii="Consolas" w:cs="Consolas" w:eastAsia="Consolas" w:hAnsi="Consolas"/>
-          <w:color w:val="9AA0A6"/>
-          <w:sz w:val="14"/>
-          <w:szCs w:val="14"/>
-        </w:rPr>
-        <w:t xml:space="preserve">AE-0181  </w:t>
-      </w:r>
-      <w:r>
-        <w:rPr>
-          <w:sz w:val="22"/>
-          <w:szCs w:val="22"/>
-        </w:rPr>
-        <w:t xml:space="preserve">Desodorante e cuidados pessoais</w:t>
-      </w:r>
-    </w:p>
-    <w:p>
-      <w:pPr>
-        <w:spacing w:after="160" w:line="300"/>
-      </w:pPr>
-      <w:r>
-        <w:rPr>
-          <w:rFonts w:ascii="Consolas" w:cs="Consolas" w:eastAsia="Consolas" w:hAnsi="Consolas"/>
-          <w:color w:val="9AA0A6"/>
-          <w:sz w:val="14"/>
-          <w:szCs w:val="14"/>
-        </w:rPr>
-        <w:t xml:space="preserve">AE-0182  </w:t>
-      </w:r>
-      <w:r>
-        <w:rPr>
-          <w:sz w:val="22"/>
-          <w:szCs w:val="22"/>
-        </w:rPr>
-        <w:t xml:space="preserve">Absorventes ou itens de higiene íntima</w:t>
-      </w:r>
-    </w:p>
-    <w:p>
-      <w:pPr>
-        <w:spacing w:after="160" w:line="300"/>
-      </w:pPr>
-      <w:r>
-        <w:rPr>
-          <w:rFonts w:ascii="Consolas" w:cs="Consolas" w:eastAsia="Consolas" w:hAnsi="Consolas"/>
-          <w:color w:val="9AA0A6"/>
-          <w:sz w:val="14"/>
-          <w:szCs w:val="14"/>
-        </w:rPr>
-        <w:t xml:space="preserve">AE-0183  </w:t>
-      </w:r>
-      <w:r>
-        <w:rPr>
-          <w:sz w:val="22"/>
-          <w:szCs w:val="22"/>
-        </w:rPr>
-        <w:t xml:space="preserve">Protetor solar FPS 30 ou maior. Tenha à mão também, creme para aliviar a dor e a inflamação da queimadura solar ou insolação</w:t>
-      </w:r>
-    </w:p>
-    <w:p>
-      <w:pPr>
-        <w:spacing w:after="160" w:line="300"/>
-      </w:pPr>
-      <w:r>
-        <w:rPr>
-          <w:rFonts w:ascii="Consolas" w:cs="Consolas" w:eastAsia="Consolas" w:hAnsi="Consolas"/>
-          <w:color w:val="9AA0A6"/>
-          <w:sz w:val="14"/>
-          <w:szCs w:val="14"/>
-        </w:rPr>
-        <w:t xml:space="preserve">AE-0184  </w:t>
-      </w:r>
-      <w:r>
-        <w:rPr>
-          <w:sz w:val="22"/>
-          <w:szCs w:val="22"/>
-        </w:rPr>
-        <w:t xml:space="preserve">Hidratante corporal — o ar do avião resseca</w:t>
+        <w:t xml:space="preserve">INTRODUCAO</w:t>
       </w:r>
     </w:p>
     <w:p>
@@ -5081,64 +5156,7 @@
           <w:sz w:val="22"/>
           <w:szCs w:val="22"/>
         </w:rPr>
-        <w:t xml:space="preserve">Repelente, sobretudo em destino tropical</w:t>
-      </w:r>
-    </w:p>
-    <w:p>
-      <w:pPr>
-        <w:spacing w:after="160" w:line="300"/>
-      </w:pPr>
-      <w:r>
-        <w:rPr>
-          <w:rFonts w:ascii="Consolas" w:cs="Consolas" w:eastAsia="Consolas" w:hAnsi="Consolas"/>
-          <w:color w:val="9AA0A6"/>
-          <w:sz w:val="14"/>
-          <w:szCs w:val="14"/>
-        </w:rPr>
-        <w:t xml:space="preserve">AE-0186  </w:t>
-      </w:r>
-      <w:r>
-        <w:rPr>
-          <w:sz w:val="22"/>
-          <w:szCs w:val="22"/>
-        </w:rPr>
-        <w:t xml:space="preserve">Lenços umedecidos antissépticos</w:t>
-      </w:r>
-    </w:p>
-    <w:p>
-      <w:pPr>
-        <w:spacing w:after="160" w:line="300"/>
-      </w:pPr>
-      <w:r>
-        <w:rPr>
-          <w:rFonts w:ascii="Consolas" w:cs="Consolas" w:eastAsia="Consolas" w:hAnsi="Consolas"/>
-          <w:color w:val="9AA0A6"/>
-          <w:sz w:val="14"/>
-          <w:szCs w:val="14"/>
-        </w:rPr>
-        <w:t xml:space="preserve">AE-0187  </w:t>
-      </w:r>
-      <w:r>
-        <w:rPr>
-          <w:sz w:val="22"/>
-          <w:szCs w:val="22"/>
-        </w:rPr>
-        <w:t xml:space="preserve">Máscaras descartáveis para lugar cheio</w:t>
-      </w:r>
-    </w:p>
-    <w:p>
-      <w:pPr>
-        <w:pStyle w:val="Heading2"/>
-        <w:spacing w:after="120" w:before="280"/>
-      </w:pPr>
-      <w:r>
-        <w:rPr>
-          <w:b/>
-          <w:bCs/>
-          <w:sz w:val="26"/>
-          <w:szCs w:val="26"/>
-        </w:rPr>
-        <w:t xml:space="preserve">Documentos Vitais</w:t>
+        <w:t xml:space="preserve">Higiene e proteção ambiental são prevenção — não são supérfluos de mala.</w:t>
       </w:r>
     </w:p>
     <w:p>
@@ -5168,6 +5186,48 @@
           <w:sz w:val="14"/>
           <w:szCs w:val="14"/>
         </w:rPr>
+        <w:t xml:space="preserve">AE-0186  </w:t>
+      </w:r>
+      <w:r>
+        <w:rPr>
+          <w:sz w:val="22"/>
+          <w:szCs w:val="22"/>
+        </w:rPr>
+        <w:t xml:space="preserve">Escova, pasta e fio dental</w:t>
+      </w:r>
+    </w:p>
+    <w:p>
+      <w:pPr>
+        <w:spacing w:after="160" w:line="300"/>
+      </w:pPr>
+      <w:r>
+        <w:rPr>
+          <w:rFonts w:ascii="Consolas" w:cs="Consolas" w:eastAsia="Consolas" w:hAnsi="Consolas"/>
+          <w:color w:val="9AA0A6"/>
+          <w:sz w:val="14"/>
+          <w:szCs w:val="14"/>
+        </w:rPr>
+        <w:t xml:space="preserve">AE-0187  </w:t>
+      </w:r>
+      <w:r>
+        <w:rPr>
+          <w:sz w:val="22"/>
+          <w:szCs w:val="22"/>
+        </w:rPr>
+        <w:t xml:space="preserve">Sabonete e xampu em tamanho de viagem</w:t>
+      </w:r>
+    </w:p>
+    <w:p>
+      <w:pPr>
+        <w:spacing w:after="160" w:line="300"/>
+      </w:pPr>
+      <w:r>
+        <w:rPr>
+          <w:rFonts w:ascii="Consolas" w:cs="Consolas" w:eastAsia="Consolas" w:hAnsi="Consolas"/>
+          <w:color w:val="9AA0A6"/>
+          <w:sz w:val="14"/>
+          <w:szCs w:val="14"/>
+        </w:rPr>
         <w:t xml:space="preserve">AE-0188  </w:t>
       </w:r>
       <w:r>
@@ -5175,7 +5235,7 @@
           <w:sz w:val="22"/>
           <w:szCs w:val="22"/>
         </w:rPr>
-        <w:t xml:space="preserve">Passaporte e RG válidos e em bom estado</w:t>
+        <w:t xml:space="preserve">Desodorante e cuidados pessoais</w:t>
       </w:r>
     </w:p>
     <w:p>
@@ -5196,7 +5256,7 @@
           <w:sz w:val="22"/>
           <w:szCs w:val="22"/>
         </w:rPr>
-        <w:t xml:space="preserve">Cartão de vacinas, físico e digital</w:t>
+        <w:t xml:space="preserve">Absorventes ou itens de higiene íntima</w:t>
       </w:r>
     </w:p>
     <w:p>
@@ -5217,7 +5277,7 @@
           <w:sz w:val="22"/>
           <w:szCs w:val="22"/>
         </w:rPr>
-        <w:t xml:space="preserve">Certidão de nascimento, para menores de idade</w:t>
+        <w:t xml:space="preserve">Protetor solar FPS 30 ou maior. Tenha à mão também, creme para aliviar a dor e a inflamação da queimadura solar ou insolação</w:t>
       </w:r>
     </w:p>
     <w:p>
@@ -5238,7 +5298,7 @@
           <w:sz w:val="22"/>
           <w:szCs w:val="22"/>
         </w:rPr>
-        <w:t xml:space="preserve">Cartão do plano de saúde e do SUS</w:t>
+        <w:t xml:space="preserve">Hidratante corporal — o ar do avião resseca</w:t>
       </w:r>
     </w:p>
     <w:p>
@@ -5259,7 +5319,7 @@
           <w:sz w:val="22"/>
           <w:szCs w:val="22"/>
         </w:rPr>
-        <w:t xml:space="preserve">Cópias dos documentos, físicas e na nuvem</w:t>
+        <w:t xml:space="preserve">Repelente, sobretudo em destino tropical</w:t>
       </w:r>
     </w:p>
     <w:p>
@@ -5280,7 +5340,7 @@
           <w:sz w:val="22"/>
           <w:szCs w:val="22"/>
         </w:rPr>
-        <w:t xml:space="preserve">Seguro viagem impresso ou acessível offline</w:t>
+        <w:t xml:space="preserve">Lenços umedecidos antissépticos</w:t>
       </w:r>
     </w:p>
     <w:p>
@@ -5301,7 +5361,7 @@
           <w:sz w:val="22"/>
           <w:szCs w:val="22"/>
         </w:rPr>
-        <w:t xml:space="preserve">Cartão de emergência: tipo sanguíneo, alergias e contatos</w:t>
+        <w:t xml:space="preserve">Máscaras descartáveis para lugar cheio</w:t>
       </w:r>
     </w:p>
     <w:p>
@@ -5316,7 +5376,7 @@
           <w:sz w:val="26"/>
           <w:szCs w:val="26"/>
         </w:rPr>
-        <w:t xml:space="preserve">Conforto e Hidratação</w:t>
+        <w:t xml:space="preserve">Documentos Vitais</w:t>
       </w:r>
     </w:p>
     <w:p>
@@ -5353,7 +5413,7 @@
           <w:sz w:val="22"/>
           <w:szCs w:val="22"/>
         </w:rPr>
-        <w:t xml:space="preserve">Evita os pequenos estresses do trajeto — e a desidratação, que passa despercebida.</w:t>
+        <w:t xml:space="preserve">Imprevisto acontece. Tenha cópia física e acesso offline.</w:t>
       </w:r>
     </w:p>
     <w:p>
@@ -5390,7 +5450,7 @@
           <w:sz w:val="22"/>
           <w:szCs w:val="22"/>
         </w:rPr>
-        <w:t xml:space="preserve">Garrafa reutilizável, vazia para encher depois do raio-x</w:t>
+        <w:t xml:space="preserve">Passaporte e RG válidos e em bom estado</w:t>
       </w:r>
     </w:p>
     <w:p>
@@ -5411,7 +5471,7 @@
           <w:sz w:val="22"/>
           <w:szCs w:val="22"/>
         </w:rPr>
-        <w:t xml:space="preserve">Pastilha ou purificador de água, em destino rural</w:t>
+        <w:t xml:space="preserve">Cartão de vacinas, físico e digital</w:t>
       </w:r>
     </w:p>
     <w:p>
@@ -5432,7 +5492,7 @@
           <w:sz w:val="22"/>
           <w:szCs w:val="22"/>
         </w:rPr>
-        <w:t xml:space="preserve">Muda de roupa leve na bagagem de mão, caso a despachada atrase</w:t>
+        <w:t xml:space="preserve">Certidão de nascimento, para menores de idade</w:t>
       </w:r>
     </w:p>
     <w:p>
@@ -5453,7 +5513,70 @@
           <w:sz w:val="22"/>
           <w:szCs w:val="22"/>
         </w:rPr>
-        <w:t xml:space="preserve">Higiene básica: escova, pasta e frascos de até 100 ml</w:t>
+        <w:t xml:space="preserve">Cartão do plano de saúde e do SUS</w:t>
+      </w:r>
+    </w:p>
+    <w:p>
+      <w:pPr>
+        <w:spacing w:after="160" w:line="300"/>
+      </w:pPr>
+      <w:r>
+        <w:rPr>
+          <w:rFonts w:ascii="Consolas" w:cs="Consolas" w:eastAsia="Consolas" w:hAnsi="Consolas"/>
+          <w:color w:val="9AA0A6"/>
+          <w:sz w:val="14"/>
+          <w:szCs w:val="14"/>
+        </w:rPr>
+        <w:t xml:space="preserve">AE-0200  </w:t>
+      </w:r>
+      <w:r>
+        <w:rPr>
+          <w:sz w:val="22"/>
+          <w:szCs w:val="22"/>
+        </w:rPr>
+        <w:t xml:space="preserve">Cópias dos documentos, físicas e na nuvem</w:t>
+      </w:r>
+    </w:p>
+    <w:p>
+      <w:pPr>
+        <w:spacing w:after="160" w:line="300"/>
+      </w:pPr>
+      <w:r>
+        <w:rPr>
+          <w:rFonts w:ascii="Consolas" w:cs="Consolas" w:eastAsia="Consolas" w:hAnsi="Consolas"/>
+          <w:color w:val="9AA0A6"/>
+          <w:sz w:val="14"/>
+          <w:szCs w:val="14"/>
+        </w:rPr>
+        <w:t xml:space="preserve">AE-0201  </w:t>
+      </w:r>
+      <w:r>
+        <w:rPr>
+          <w:sz w:val="22"/>
+          <w:szCs w:val="22"/>
+        </w:rPr>
+        <w:t xml:space="preserve">Seguro viagem impresso ou acessível offline</w:t>
+      </w:r>
+    </w:p>
+    <w:p>
+      <w:pPr>
+        <w:spacing w:after="160" w:line="300"/>
+      </w:pPr>
+      <w:r>
+        <w:rPr>
+          <w:rFonts w:ascii="Consolas" w:cs="Consolas" w:eastAsia="Consolas" w:hAnsi="Consolas"/>
+          <w:color w:val="9AA0A6"/>
+          <w:sz w:val="14"/>
+          <w:szCs w:val="14"/>
+        </w:rPr>
+        <w:t xml:space="preserve">AE-0202  </w:t>
+      </w:r>
+      <w:r>
+        <w:rPr>
+          <w:sz w:val="22"/>
+          <w:szCs w:val="22"/>
+        </w:rPr>
+        <w:t xml:space="preserve">Cartão de emergência: tipo sanguíneo, alergias e contatos</w:t>
       </w:r>
     </w:p>
     <w:p>
@@ -5468,7 +5591,7 @@
           <w:sz w:val="26"/>
           <w:szCs w:val="26"/>
         </w:rPr>
-        <w:t xml:space="preserve">Módulo de Trabalho</w:t>
+        <w:t xml:space="preserve">Conforto e Hidratação</w:t>
       </w:r>
     </w:p>
     <w:p>
@@ -5484,70 +5607,7 @@
           <w:sz w:val="16"/>
           <w:szCs w:val="16"/>
         </w:rPr>
-        <w:t xml:space="preserve">ITENS</w:t>
-      </w:r>
-    </w:p>
-    <w:p>
-      <w:pPr>
-        <w:spacing w:after="160" w:line="300"/>
-      </w:pPr>
-      <w:r>
-        <w:rPr>
-          <w:rFonts w:ascii="Consolas" w:cs="Consolas" w:eastAsia="Consolas" w:hAnsi="Consolas"/>
-          <w:color w:val="9AA0A6"/>
-          <w:sz w:val="14"/>
-          <w:szCs w:val="14"/>
-        </w:rPr>
-        <w:t xml:space="preserve">AE-0200  </w:t>
-      </w:r>
-      <w:r>
-        <w:rPr>
-          <w:sz w:val="22"/>
-          <w:szCs w:val="22"/>
-        </w:rPr>
-        <w:t xml:space="preserve">Notebook, tablet e carregadores</w:t>
-      </w:r>
-    </w:p>
-    <w:p>
-      <w:pPr>
-        <w:spacing w:after="160" w:line="300"/>
-      </w:pPr>
-      <w:r>
-        <w:rPr>
-          <w:rFonts w:ascii="Consolas" w:cs="Consolas" w:eastAsia="Consolas" w:hAnsi="Consolas"/>
-          <w:color w:val="9AA0A6"/>
-          <w:sz w:val="14"/>
-          <w:szCs w:val="14"/>
-        </w:rPr>
-        <w:t xml:space="preserve">AE-0201  </w:t>
-      </w:r>
-      <w:r>
-        <w:rPr>
-          <w:sz w:val="22"/>
-          <w:szCs w:val="22"/>
-        </w:rPr>
-        <w:t xml:space="preserve">Powerbank e adaptador universal</w:t>
-      </w:r>
-    </w:p>
-    <w:p>
-      <w:pPr>
-        <w:spacing w:after="160" w:line="300"/>
-      </w:pPr>
-      <w:r>
-        <w:rPr>
-          <w:rFonts w:ascii="Consolas" w:cs="Consolas" w:eastAsia="Consolas" w:hAnsi="Consolas"/>
-          <w:color w:val="9AA0A6"/>
-          <w:sz w:val="14"/>
-          <w:szCs w:val="14"/>
-        </w:rPr>
-        <w:t xml:space="preserve">AE-0202  </w:t>
-      </w:r>
-      <w:r>
-        <w:rPr>
-          <w:sz w:val="22"/>
-          <w:szCs w:val="22"/>
-        </w:rPr>
-        <w:t xml:space="preserve">Fones com cancelamento de ruído</w:t>
+        <w:t xml:space="preserve">INTRODUCAO</w:t>
       </w:r>
     </w:p>
     <w:p>
@@ -5568,22 +5628,7 @@
           <w:sz w:val="22"/>
           <w:szCs w:val="22"/>
         </w:rPr>
-        <w:t xml:space="preserve">Cadeado de cabo para o notebook</w:t>
-      </w:r>
-    </w:p>
-    <w:p>
-      <w:pPr>
-        <w:pStyle w:val="Heading2"/>
-        <w:spacing w:after="120" w:before="280"/>
-      </w:pPr>
-      <w:r>
-        <w:rPr>
-          <w:b/>
-          <w:bCs/>
-          <w:sz w:val="26"/>
-          <w:szCs w:val="26"/>
-        </w:rPr>
-        <w:t xml:space="preserve">Módulo Pet</w:t>
+        <w:t xml:space="preserve">Evita os pequenos estresses do trajeto — e a desidratação, que passa despercebida.</w:t>
       </w:r>
     </w:p>
     <w:p>
@@ -5620,7 +5665,7 @@
           <w:sz w:val="22"/>
           <w:szCs w:val="22"/>
         </w:rPr>
-        <w:t xml:space="preserve">Carteira de vacinação do pet atualizada</w:t>
+        <w:t xml:space="preserve">Garrafa reutilizável, vazia para encher depois do raio-x</w:t>
       </w:r>
     </w:p>
     <w:p>
@@ -5641,7 +5686,7 @@
           <w:sz w:val="22"/>
           <w:szCs w:val="22"/>
         </w:rPr>
-        <w:t xml:space="preserve">Caixa de transporte adequada ao meio de transporte</w:t>
+        <w:t xml:space="preserve">Pastilha ou purificador de água, em destino rural</w:t>
       </w:r>
     </w:p>
     <w:p>
@@ -5662,7 +5707,7 @@
           <w:sz w:val="22"/>
           <w:szCs w:val="22"/>
         </w:rPr>
-        <w:t xml:space="preserve">Coleira extra com plaquinha de identificação e microchip</w:t>
+        <w:t xml:space="preserve">Muda de roupa leve na bagagem de mão, caso a despachada atrase</w:t>
       </w:r>
     </w:p>
     <w:p>
@@ -5683,49 +5728,7 @@
           <w:sz w:val="22"/>
           <w:szCs w:val="22"/>
         </w:rPr>
-        <w:t xml:space="preserve">Medicamentos específicos do animal</w:t>
-      </w:r>
-    </w:p>
-    <w:p>
-      <w:pPr>
-        <w:spacing w:after="160" w:line="300"/>
-      </w:pPr>
-      <w:r>
-        <w:rPr>
-          <w:rFonts w:ascii="Consolas" w:cs="Consolas" w:eastAsia="Consolas" w:hAnsi="Consolas"/>
-          <w:color w:val="9AA0A6"/>
-          <w:sz w:val="14"/>
-          <w:szCs w:val="14"/>
-        </w:rPr>
-        <w:t xml:space="preserve">AE-0208  </w:t>
-      </w:r>
-      <w:r>
-        <w:rPr>
-          <w:sz w:val="22"/>
-          <w:szCs w:val="22"/>
-        </w:rPr>
-        <w:t xml:space="preserve">Comedouro e bebedouro portáteis</w:t>
-      </w:r>
-    </w:p>
-    <w:p>
-      <w:pPr>
-        <w:spacing w:after="160" w:line="300"/>
-      </w:pPr>
-      <w:r>
-        <w:rPr>
-          <w:rFonts w:ascii="Consolas" w:cs="Consolas" w:eastAsia="Consolas" w:hAnsi="Consolas"/>
-          <w:color w:val="9AA0A6"/>
-          <w:sz w:val="14"/>
-          <w:szCs w:val="14"/>
-        </w:rPr>
-        <w:t xml:space="preserve">AE-0209  </w:t>
-      </w:r>
-      <w:r>
-        <w:rPr>
-          <w:sz w:val="22"/>
-          <w:szCs w:val="22"/>
-        </w:rPr>
-        <w:t xml:space="preserve">Alimento e água para o trajeto</w:t>
+        <w:t xml:space="preserve">Higiene básica: escova, pasta e frascos de até 100 ml</w:t>
       </w:r>
     </w:p>
     <w:p>
@@ -5740,7 +5743,7 @@
           <w:sz w:val="26"/>
           <w:szCs w:val="26"/>
         </w:rPr>
-        <w:t xml:space="preserve">Módulo Infantil</w:t>
+        <w:t xml:space="preserve">Módulo de Lazer</w:t>
       </w:r>
     </w:p>
     <w:p>
@@ -5756,91 +5759,28 @@
           <w:sz w:val="16"/>
           <w:szCs w:val="16"/>
         </w:rPr>
-        <w:t xml:space="preserve">ITENS</w:t>
-      </w:r>
-    </w:p>
-    <w:p>
-      <w:pPr>
-        <w:spacing w:after="160" w:line="300"/>
-      </w:pPr>
-      <w:r>
-        <w:rPr>
-          <w:rFonts w:ascii="Consolas" w:cs="Consolas" w:eastAsia="Consolas" w:hAnsi="Consolas"/>
-          <w:color w:val="9AA0A6"/>
-          <w:sz w:val="14"/>
-          <w:szCs w:val="14"/>
-        </w:rPr>
-        <w:t xml:space="preserve">AE-0210  </w:t>
-      </w:r>
-      <w:r>
-        <w:rPr>
-          <w:sz w:val="22"/>
-          <w:szCs w:val="22"/>
-        </w:rPr>
-        <w:t xml:space="preserve">Medicamentos pediátricos específicos (enjoo, febre)</w:t>
-      </w:r>
-    </w:p>
-    <w:p>
-      <w:pPr>
-        <w:spacing w:after="160" w:line="300"/>
-      </w:pPr>
-      <w:r>
-        <w:rPr>
-          <w:rFonts w:ascii="Consolas" w:cs="Consolas" w:eastAsia="Consolas" w:hAnsi="Consolas"/>
-          <w:color w:val="9AA0A6"/>
-          <w:sz w:val="14"/>
-          <w:szCs w:val="14"/>
-        </w:rPr>
-        <w:t xml:space="preserve">AE-0211  </w:t>
-      </w:r>
-      <w:r>
-        <w:rPr>
-          <w:sz w:val="22"/>
-          <w:szCs w:val="22"/>
-        </w:rPr>
-        <w:t xml:space="preserve">Pulseira de identificação com nome e telefone</w:t>
-      </w:r>
-    </w:p>
-    <w:p>
-      <w:pPr>
-        <w:spacing w:after="160" w:line="300"/>
-      </w:pPr>
-      <w:r>
-        <w:rPr>
-          <w:rFonts w:ascii="Consolas" w:cs="Consolas" w:eastAsia="Consolas" w:hAnsi="Consolas"/>
-          <w:color w:val="9AA0A6"/>
-          <w:sz w:val="14"/>
-          <w:szCs w:val="14"/>
-        </w:rPr>
-        <w:t xml:space="preserve">AE-0212  </w:t>
-      </w:r>
-      <w:r>
-        <w:rPr>
-          <w:sz w:val="22"/>
-          <w:szCs w:val="22"/>
-        </w:rPr>
-        <w:t xml:space="preserve">Lanches fáceis e sem farelo</w:t>
-      </w:r>
-    </w:p>
-    <w:p>
-      <w:pPr>
-        <w:spacing w:after="160" w:line="300"/>
-      </w:pPr>
-      <w:r>
-        <w:rPr>
-          <w:rFonts w:ascii="Consolas" w:cs="Consolas" w:eastAsia="Consolas" w:hAnsi="Consolas"/>
-          <w:color w:val="9AA0A6"/>
-          <w:sz w:val="14"/>
-          <w:szCs w:val="14"/>
-        </w:rPr>
-        <w:t xml:space="preserve">AE-0213  </w:t>
-      </w:r>
-      <w:r>
-        <w:rPr>
-          <w:sz w:val="22"/>
-          <w:szCs w:val="22"/>
-        </w:rPr>
-        <w:t xml:space="preserve">Brinquedo de apego e itens de distração</w:t>
+        <w:t xml:space="preserve">INTRODUCAO</w:t>
+      </w:r>
+    </w:p>
+    <w:p>
+      <w:pPr>
+        <w:spacing w:after="160" w:line="300"/>
+      </w:pPr>
+      <w:r>
+        <w:rPr>
+          <w:rFonts w:ascii="Consolas" w:cs="Consolas" w:eastAsia="Consolas" w:hAnsi="Consolas"/>
+          <w:color w:val="9AA0A6"/>
+          <w:sz w:val="14"/>
+          <w:szCs w:val="14"/>
+        </w:rPr>
+        <w:t xml:space="preserve">AE-0208  </w:t>
+      </w:r>
+      <w:r>
+        <w:rPr>
+          <w:sz w:val="22"/>
+          <w:szCs w:val="22"/>
+        </w:rPr>
+        <w:t xml:space="preserve">Itens para diversão e atividade ao ar livre.</w:t>
       </w:r>
     </w:p>
     <w:p>
@@ -5850,21 +5790,12 @@
       </w:pPr>
       <w:r>
         <w:rPr>
-          <w:rFonts w:ascii="Consolas" w:cs="Consolas" w:eastAsia="Consolas" w:hAnsi="Consolas"/>
-          <w:color w:val="9AA0A6"/>
-          <w:sz w:val="14"/>
-          <w:szCs w:val="14"/>
-        </w:rPr>
-        <w:t xml:space="preserve">AE-0214  </w:t>
-      </w:r>
-      <w:r>
-        <w:rPr>
           <w:b/>
           <w:bCs/>
           <w:sz w:val="26"/>
           <w:szCs w:val="26"/>
         </w:rPr>
-        <w:t xml:space="preserve">Módulo Acessibilidade e Apoio</w:t>
+        <w:t xml:space="preserve">Módulo de Trabalho</w:t>
       </w:r>
     </w:p>
     <w:p>
@@ -5880,106 +5811,28 @@
           <w:sz w:val="16"/>
           <w:szCs w:val="16"/>
         </w:rPr>
-        <w:t xml:space="preserve">ITENS</w:t>
-      </w:r>
-    </w:p>
-    <w:p>
-      <w:pPr>
-        <w:spacing w:after="160" w:line="300"/>
-      </w:pPr>
-      <w:r>
-        <w:rPr>
-          <w:rFonts w:ascii="Consolas" w:cs="Consolas" w:eastAsia="Consolas" w:hAnsi="Consolas"/>
-          <w:color w:val="9AA0A6"/>
-          <w:sz w:val="14"/>
-          <w:szCs w:val="14"/>
-        </w:rPr>
-        <w:t xml:space="preserve">AE-0215  </w:t>
-      </w:r>
-      <w:r>
-        <w:rPr>
-          <w:sz w:val="22"/>
-          <w:szCs w:val="22"/>
-        </w:rPr>
-        <w:t xml:space="preserve">Bengala, andador ou cadeira de rodas revisados</w:t>
-      </w:r>
-    </w:p>
-    <w:p>
-      <w:pPr>
-        <w:spacing w:after="160" w:line="300"/>
-      </w:pPr>
-      <w:r>
-        <w:rPr>
-          <w:rFonts w:ascii="Consolas" w:cs="Consolas" w:eastAsia="Consolas" w:hAnsi="Consolas"/>
-          <w:color w:val="9AA0A6"/>
-          <w:sz w:val="14"/>
-          <w:szCs w:val="14"/>
-        </w:rPr>
-        <w:t xml:space="preserve">AE-0216  </w:t>
-      </w:r>
-      <w:r>
-        <w:rPr>
-          <w:sz w:val="22"/>
-          <w:szCs w:val="22"/>
-        </w:rPr>
-        <w:t xml:space="preserve">Laudos médicos, sobretudo para voo e cruzeiro</w:t>
-      </w:r>
-    </w:p>
-    <w:p>
-      <w:pPr>
-        <w:spacing w:after="160" w:line="300"/>
-      </w:pPr>
-      <w:r>
-        <w:rPr>
-          <w:rFonts w:ascii="Consolas" w:cs="Consolas" w:eastAsia="Consolas" w:hAnsi="Consolas"/>
-          <w:color w:val="9AA0A6"/>
-          <w:sz w:val="14"/>
-          <w:szCs w:val="14"/>
-        </w:rPr>
-        <w:t xml:space="preserve">AE-0217  </w:t>
-      </w:r>
-      <w:r>
-        <w:rPr>
-          <w:sz w:val="22"/>
-          <w:szCs w:val="22"/>
-        </w:rPr>
-        <w:t xml:space="preserve">Calçado muito confortável e antiderrapante</w:t>
-      </w:r>
-    </w:p>
-    <w:p>
-      <w:pPr>
-        <w:spacing w:after="160" w:line="300"/>
-      </w:pPr>
-      <w:r>
-        <w:rPr>
-          <w:rFonts w:ascii="Consolas" w:cs="Consolas" w:eastAsia="Consolas" w:hAnsi="Consolas"/>
-          <w:color w:val="9AA0A6"/>
-          <w:sz w:val="14"/>
-          <w:szCs w:val="14"/>
-        </w:rPr>
-        <w:t xml:space="preserve">AE-0218  </w:t>
-      </w:r>
-      <w:r>
-        <w:rPr>
-          <w:sz w:val="22"/>
-          <w:szCs w:val="22"/>
-        </w:rPr>
-        <w:t xml:space="preserve">Travesseiro de pescoço ergonômico</w:t>
-      </w:r>
-    </w:p>
-    <w:p>
-      <w:pPr>
-        <w:pStyle w:val="Heading2"/>
-        <w:spacing w:after="120" w:before="280"/>
-      </w:pPr>
-      <w:r>
-        <w:rPr>
-          <w:b/>
-          <w:bCs/>
-          <w:sz w:val="26"/>
-          <w:szCs w:val="26"/>
-        </w:rPr>
-        <w:t xml:space="preserve">Módulo Praia e Resort</w:t>
+        <w:t xml:space="preserve">INTRODUCAO</w:t>
+      </w:r>
+    </w:p>
+    <w:p>
+      <w:pPr>
+        <w:spacing w:after="160" w:line="300"/>
+      </w:pPr>
+      <w:r>
+        <w:rPr>
+          <w:rFonts w:ascii="Consolas" w:cs="Consolas" w:eastAsia="Consolas" w:hAnsi="Consolas"/>
+          <w:color w:val="9AA0A6"/>
+          <w:sz w:val="14"/>
+          <w:szCs w:val="14"/>
+        </w:rPr>
+        <w:t xml:space="preserve">AE-0209  </w:t>
+      </w:r>
+      <w:r>
+        <w:rPr>
+          <w:sz w:val="22"/>
+          <w:szCs w:val="22"/>
+        </w:rPr>
+        <w:t xml:space="preserve">Segurança para equipamento e produtividade.</w:t>
       </w:r>
     </w:p>
     <w:p>
@@ -6009,56 +5862,77 @@
           <w:sz w:val="14"/>
           <w:szCs w:val="14"/>
         </w:rPr>
-        <w:t xml:space="preserve">AE-0219  </w:t>
-      </w:r>
-      <w:r>
-        <w:rPr>
-          <w:sz w:val="22"/>
-          <w:szCs w:val="22"/>
-        </w:rPr>
-        <w:t xml:space="preserve">Repelente resistente à água</w:t>
-      </w:r>
-    </w:p>
-    <w:p>
-      <w:pPr>
-        <w:spacing w:after="160" w:line="300"/>
-      </w:pPr>
-      <w:r>
-        <w:rPr>
-          <w:rFonts w:ascii="Consolas" w:cs="Consolas" w:eastAsia="Consolas" w:hAnsi="Consolas"/>
-          <w:color w:val="9AA0A6"/>
-          <w:sz w:val="14"/>
-          <w:szCs w:val="14"/>
-        </w:rPr>
-        <w:t xml:space="preserve">AE-0220  </w:t>
-      </w:r>
-      <w:r>
-        <w:rPr>
-          <w:sz w:val="22"/>
-          <w:szCs w:val="22"/>
-        </w:rPr>
-        <w:t xml:space="preserve">Boia de corpo ou colete salva-vidas infantil</w:t>
-      </w:r>
-    </w:p>
-    <w:p>
-      <w:pPr>
-        <w:spacing w:after="160" w:line="300"/>
-      </w:pPr>
-      <w:r>
-        <w:rPr>
-          <w:rFonts w:ascii="Consolas" w:cs="Consolas" w:eastAsia="Consolas" w:hAnsi="Consolas"/>
-          <w:color w:val="9AA0A6"/>
-          <w:sz w:val="14"/>
-          <w:szCs w:val="14"/>
-        </w:rPr>
-        <w:t xml:space="preserve">AE-0221  </w:t>
-      </w:r>
-      <w:r>
-        <w:rPr>
-          <w:sz w:val="22"/>
-          <w:szCs w:val="22"/>
-        </w:rPr>
-        <w:t xml:space="preserve">Saco estanque para proteger o celular da areia e da água</w:t>
+        <w:t xml:space="preserve">AE-0210  </w:t>
+      </w:r>
+      <w:r>
+        <w:rPr>
+          <w:sz w:val="22"/>
+          <w:szCs w:val="22"/>
+        </w:rPr>
+        <w:t xml:space="preserve">Notebook, tablet e carregadores</w:t>
+      </w:r>
+    </w:p>
+    <w:p>
+      <w:pPr>
+        <w:spacing w:after="160" w:line="300"/>
+      </w:pPr>
+      <w:r>
+        <w:rPr>
+          <w:rFonts w:ascii="Consolas" w:cs="Consolas" w:eastAsia="Consolas" w:hAnsi="Consolas"/>
+          <w:color w:val="9AA0A6"/>
+          <w:sz w:val="14"/>
+          <w:szCs w:val="14"/>
+        </w:rPr>
+        <w:t xml:space="preserve">AE-0211  </w:t>
+      </w:r>
+      <w:r>
+        <w:rPr>
+          <w:sz w:val="22"/>
+          <w:szCs w:val="22"/>
+        </w:rPr>
+        <w:t xml:space="preserve">Powerbank e adaptador universal</w:t>
+      </w:r>
+    </w:p>
+    <w:p>
+      <w:pPr>
+        <w:spacing w:after="160" w:line="300"/>
+      </w:pPr>
+      <w:r>
+        <w:rPr>
+          <w:rFonts w:ascii="Consolas" w:cs="Consolas" w:eastAsia="Consolas" w:hAnsi="Consolas"/>
+          <w:color w:val="9AA0A6"/>
+          <w:sz w:val="14"/>
+          <w:szCs w:val="14"/>
+        </w:rPr>
+        <w:t xml:space="preserve">AE-0212  </w:t>
+      </w:r>
+      <w:r>
+        <w:rPr>
+          <w:sz w:val="22"/>
+          <w:szCs w:val="22"/>
+        </w:rPr>
+        <w:t xml:space="preserve">Fones com cancelamento de ruído</w:t>
+      </w:r>
+    </w:p>
+    <w:p>
+      <w:pPr>
+        <w:spacing w:after="160" w:line="300"/>
+      </w:pPr>
+      <w:r>
+        <w:rPr>
+          <w:rFonts w:ascii="Consolas" w:cs="Consolas" w:eastAsia="Consolas" w:hAnsi="Consolas"/>
+          <w:color w:val="9AA0A6"/>
+          <w:sz w:val="14"/>
+          <w:szCs w:val="14"/>
+        </w:rPr>
+        <w:t xml:space="preserve">AE-0213  </w:t>
+      </w:r>
+      <w:r>
+        <w:rPr>
+          <w:sz w:val="22"/>
+          <w:szCs w:val="22"/>
+        </w:rPr>
+        <w:t xml:space="preserve">Cadeado de cabo para o notebook</w:t>
       </w:r>
     </w:p>
     <w:p>
@@ -6073,7 +5947,7 @@
           <w:sz w:val="26"/>
           <w:szCs w:val="26"/>
         </w:rPr>
-        <w:t xml:space="preserve">Módulo Campo e Natureza</w:t>
+        <w:t xml:space="preserve">Módulo Pet</w:t>
       </w:r>
     </w:p>
     <w:p>
@@ -6089,85 +5963,28 @@
           <w:sz w:val="16"/>
           <w:szCs w:val="16"/>
         </w:rPr>
-        <w:t xml:space="preserve">ITENS</w:t>
-      </w:r>
-    </w:p>
-    <w:p>
-      <w:pPr>
-        <w:spacing w:after="160" w:line="300"/>
-      </w:pPr>
-      <w:r>
-        <w:rPr>
-          <w:rFonts w:ascii="Consolas" w:cs="Consolas" w:eastAsia="Consolas" w:hAnsi="Consolas"/>
-          <w:color w:val="9AA0A6"/>
-          <w:sz w:val="14"/>
-          <w:szCs w:val="14"/>
-        </w:rPr>
-        <w:t xml:space="preserve">AE-0222  </w:t>
-      </w:r>
-      <w:r>
-        <w:rPr>
-          <w:sz w:val="22"/>
-          <w:szCs w:val="22"/>
-        </w:rPr>
-        <w:t xml:space="preserve">Repelente forte (icaridina) para carrapato e mosquito</w:t>
-      </w:r>
-    </w:p>
-    <w:p>
-      <w:pPr>
-        <w:spacing w:after="160" w:line="300"/>
-      </w:pPr>
-      <w:r>
-        <w:rPr>
-          <w:rFonts w:ascii="Consolas" w:cs="Consolas" w:eastAsia="Consolas" w:hAnsi="Consolas"/>
-          <w:color w:val="9AA0A6"/>
-          <w:sz w:val="14"/>
-          <w:szCs w:val="14"/>
-        </w:rPr>
-        <w:t xml:space="preserve">AE-0223  </w:t>
-      </w:r>
-      <w:r>
-        <w:rPr>
-          <w:sz w:val="22"/>
-          <w:szCs w:val="22"/>
-        </w:rPr>
-        <w:t xml:space="preserve">Bota ou calçado fechado, contra animais peçonhentos</w:t>
-      </w:r>
-    </w:p>
-    <w:p>
-      <w:pPr>
-        <w:spacing w:after="160" w:line="300"/>
-      </w:pPr>
-      <w:r>
-        <w:rPr>
-          <w:rFonts w:ascii="Consolas" w:cs="Consolas" w:eastAsia="Consolas" w:hAnsi="Consolas"/>
-          <w:color w:val="9AA0A6"/>
-          <w:sz w:val="14"/>
-          <w:szCs w:val="14"/>
-        </w:rPr>
-        <w:t xml:space="preserve">AE-0224  </w:t>
-      </w:r>
-      <w:r>
-        <w:rPr>
-          <w:sz w:val="22"/>
-          <w:szCs w:val="22"/>
-        </w:rPr>
-        <w:t xml:space="preserve">Lanterna de cabeça com pilhas extras</w:t>
-      </w:r>
-    </w:p>
-    <w:p>
-      <w:pPr>
-        <w:pStyle w:val="Heading2"/>
-        <w:spacing w:after="120" w:before="280"/>
-      </w:pPr>
-      <w:r>
-        <w:rPr>
-          <w:b/>
-          <w:bCs/>
-          <w:sz w:val="26"/>
-          <w:szCs w:val="26"/>
-        </w:rPr>
-        <w:t xml:space="preserve">Módulo Internacional</w:t>
+        <w:t xml:space="preserve">INTRODUCAO</w:t>
+      </w:r>
+    </w:p>
+    <w:p>
+      <w:pPr>
+        <w:spacing w:after="160" w:line="300"/>
+      </w:pPr>
+      <w:r>
+        <w:rPr>
+          <w:rFonts w:ascii="Consolas" w:cs="Consolas" w:eastAsia="Consolas" w:hAnsi="Consolas"/>
+          <w:color w:val="9AA0A6"/>
+          <w:sz w:val="14"/>
+          <w:szCs w:val="14"/>
+        </w:rPr>
+        <w:t xml:space="preserve">AE-0214  </w:t>
+      </w:r>
+      <w:r>
+        <w:rPr>
+          <w:sz w:val="22"/>
+          <w:szCs w:val="22"/>
+        </w:rPr>
+        <w:t xml:space="preserve">Segurança e bem-estar do animal.</w:t>
       </w:r>
     </w:p>
     <w:p>
@@ -6197,6 +6014,263 @@
           <w:sz w:val="14"/>
           <w:szCs w:val="14"/>
         </w:rPr>
+        <w:t xml:space="preserve">AE-0215  </w:t>
+      </w:r>
+      <w:r>
+        <w:rPr>
+          <w:sz w:val="22"/>
+          <w:szCs w:val="22"/>
+        </w:rPr>
+        <w:t xml:space="preserve">Carteira de vacinação do pet atualizada</w:t>
+      </w:r>
+    </w:p>
+    <w:p>
+      <w:pPr>
+        <w:spacing w:after="160" w:line="300"/>
+      </w:pPr>
+      <w:r>
+        <w:rPr>
+          <w:rFonts w:ascii="Consolas" w:cs="Consolas" w:eastAsia="Consolas" w:hAnsi="Consolas"/>
+          <w:color w:val="9AA0A6"/>
+          <w:sz w:val="14"/>
+          <w:szCs w:val="14"/>
+        </w:rPr>
+        <w:t xml:space="preserve">AE-0216  </w:t>
+      </w:r>
+      <w:r>
+        <w:rPr>
+          <w:sz w:val="22"/>
+          <w:szCs w:val="22"/>
+        </w:rPr>
+        <w:t xml:space="preserve">Caixa de transporte adequada ao meio de transporte</w:t>
+      </w:r>
+    </w:p>
+    <w:p>
+      <w:pPr>
+        <w:spacing w:after="160" w:line="300"/>
+      </w:pPr>
+      <w:r>
+        <w:rPr>
+          <w:rFonts w:ascii="Consolas" w:cs="Consolas" w:eastAsia="Consolas" w:hAnsi="Consolas"/>
+          <w:color w:val="9AA0A6"/>
+          <w:sz w:val="14"/>
+          <w:szCs w:val="14"/>
+        </w:rPr>
+        <w:t xml:space="preserve">AE-0217  </w:t>
+      </w:r>
+      <w:r>
+        <w:rPr>
+          <w:sz w:val="22"/>
+          <w:szCs w:val="22"/>
+        </w:rPr>
+        <w:t xml:space="preserve">Coleira extra com plaquinha de identificação e microchip</w:t>
+      </w:r>
+    </w:p>
+    <w:p>
+      <w:pPr>
+        <w:spacing w:after="160" w:line="300"/>
+      </w:pPr>
+      <w:r>
+        <w:rPr>
+          <w:rFonts w:ascii="Consolas" w:cs="Consolas" w:eastAsia="Consolas" w:hAnsi="Consolas"/>
+          <w:color w:val="9AA0A6"/>
+          <w:sz w:val="14"/>
+          <w:szCs w:val="14"/>
+        </w:rPr>
+        <w:t xml:space="preserve">AE-0218  </w:t>
+      </w:r>
+      <w:r>
+        <w:rPr>
+          <w:sz w:val="22"/>
+          <w:szCs w:val="22"/>
+        </w:rPr>
+        <w:t xml:space="preserve">Medicamentos específicos do animal</w:t>
+      </w:r>
+    </w:p>
+    <w:p>
+      <w:pPr>
+        <w:spacing w:after="160" w:line="300"/>
+      </w:pPr>
+      <w:r>
+        <w:rPr>
+          <w:rFonts w:ascii="Consolas" w:cs="Consolas" w:eastAsia="Consolas" w:hAnsi="Consolas"/>
+          <w:color w:val="9AA0A6"/>
+          <w:sz w:val="14"/>
+          <w:szCs w:val="14"/>
+        </w:rPr>
+        <w:t xml:space="preserve">AE-0219  </w:t>
+      </w:r>
+      <w:r>
+        <w:rPr>
+          <w:sz w:val="22"/>
+          <w:szCs w:val="22"/>
+        </w:rPr>
+        <w:t xml:space="preserve">Comedouro e bebedouro portáteis</w:t>
+      </w:r>
+    </w:p>
+    <w:p>
+      <w:pPr>
+        <w:spacing w:after="160" w:line="300"/>
+      </w:pPr>
+      <w:r>
+        <w:rPr>
+          <w:rFonts w:ascii="Consolas" w:cs="Consolas" w:eastAsia="Consolas" w:hAnsi="Consolas"/>
+          <w:color w:val="9AA0A6"/>
+          <w:sz w:val="14"/>
+          <w:szCs w:val="14"/>
+        </w:rPr>
+        <w:t xml:space="preserve">AE-0220  </w:t>
+      </w:r>
+      <w:r>
+        <w:rPr>
+          <w:sz w:val="22"/>
+          <w:szCs w:val="22"/>
+        </w:rPr>
+        <w:t xml:space="preserve">Alimento e água para o trajeto</w:t>
+      </w:r>
+    </w:p>
+    <w:p>
+      <w:pPr>
+        <w:pStyle w:val="Heading2"/>
+        <w:spacing w:after="120" w:before="280"/>
+      </w:pPr>
+      <w:r>
+        <w:rPr>
+          <w:b/>
+          <w:bCs/>
+          <w:sz w:val="26"/>
+          <w:szCs w:val="26"/>
+        </w:rPr>
+        <w:t xml:space="preserve">Módulo Infantil</w:t>
+      </w:r>
+    </w:p>
+    <w:p>
+      <w:pPr>
+        <w:spacing w:after="60" w:before="180"/>
+      </w:pPr>
+      <w:r>
+        <w:rPr>
+          <w:b/>
+          <w:bCs/>
+          <w:color w:val="9AA0A6"/>
+          <w:spacing w:val="20"/>
+          <w:sz w:val="16"/>
+          <w:szCs w:val="16"/>
+        </w:rPr>
+        <w:t xml:space="preserve">INTRODUCAO</w:t>
+      </w:r>
+    </w:p>
+    <w:p>
+      <w:pPr>
+        <w:spacing w:after="160" w:line="300"/>
+      </w:pPr>
+      <w:r>
+        <w:rPr>
+          <w:rFonts w:ascii="Consolas" w:cs="Consolas" w:eastAsia="Consolas" w:hAnsi="Consolas"/>
+          <w:color w:val="9AA0A6"/>
+          <w:sz w:val="14"/>
+          <w:szCs w:val="14"/>
+        </w:rPr>
+        <w:t xml:space="preserve">AE-0221  </w:t>
+      </w:r>
+      <w:r>
+        <w:rPr>
+          <w:sz w:val="22"/>
+          <w:szCs w:val="22"/>
+        </w:rPr>
+        <w:t xml:space="preserve">Cuidado e distração para os pequenos.</w:t>
+      </w:r>
+    </w:p>
+    <w:p>
+      <w:pPr>
+        <w:spacing w:after="60" w:before="180"/>
+      </w:pPr>
+      <w:r>
+        <w:rPr>
+          <w:b/>
+          <w:bCs/>
+          <w:color w:val="9AA0A6"/>
+          <w:spacing w:val="20"/>
+          <w:sz w:val="16"/>
+          <w:szCs w:val="16"/>
+        </w:rPr>
+        <w:t xml:space="preserve">ITENS</w:t>
+      </w:r>
+    </w:p>
+    <w:p>
+      <w:pPr>
+        <w:spacing w:after="160" w:line="300"/>
+      </w:pPr>
+      <w:r>
+        <w:rPr>
+          <w:rFonts w:ascii="Consolas" w:cs="Consolas" w:eastAsia="Consolas" w:hAnsi="Consolas"/>
+          <w:color w:val="9AA0A6"/>
+          <w:sz w:val="14"/>
+          <w:szCs w:val="14"/>
+        </w:rPr>
+        <w:t xml:space="preserve">AE-0222  </w:t>
+      </w:r>
+      <w:r>
+        <w:rPr>
+          <w:sz w:val="22"/>
+          <w:szCs w:val="22"/>
+        </w:rPr>
+        <w:t xml:space="preserve">Medicamentos pediátricos específicos (enjoo, febre)</w:t>
+      </w:r>
+    </w:p>
+    <w:p>
+      <w:pPr>
+        <w:spacing w:after="160" w:line="300"/>
+      </w:pPr>
+      <w:r>
+        <w:rPr>
+          <w:rFonts w:ascii="Consolas" w:cs="Consolas" w:eastAsia="Consolas" w:hAnsi="Consolas"/>
+          <w:color w:val="9AA0A6"/>
+          <w:sz w:val="14"/>
+          <w:szCs w:val="14"/>
+        </w:rPr>
+        <w:t xml:space="preserve">AE-0223  </w:t>
+      </w:r>
+      <w:r>
+        <w:rPr>
+          <w:sz w:val="22"/>
+          <w:szCs w:val="22"/>
+        </w:rPr>
+        <w:t xml:space="preserve">Pulseira de identificação com nome e telefone</w:t>
+      </w:r>
+    </w:p>
+    <w:p>
+      <w:pPr>
+        <w:spacing w:after="160" w:line="300"/>
+      </w:pPr>
+      <w:r>
+        <w:rPr>
+          <w:rFonts w:ascii="Consolas" w:cs="Consolas" w:eastAsia="Consolas" w:hAnsi="Consolas"/>
+          <w:color w:val="9AA0A6"/>
+          <w:sz w:val="14"/>
+          <w:szCs w:val="14"/>
+        </w:rPr>
+        <w:t xml:space="preserve">AE-0224  </w:t>
+      </w:r>
+      <w:r>
+        <w:rPr>
+          <w:sz w:val="22"/>
+          <w:szCs w:val="22"/>
+        </w:rPr>
+        <w:t xml:space="preserve">Lanches fáceis e sem farelo</w:t>
+      </w:r>
+    </w:p>
+    <w:p>
+      <w:pPr>
+        <w:spacing w:after="160" w:line="300"/>
+      </w:pPr>
+      <w:r>
+        <w:rPr>
+          <w:rFonts w:ascii="Consolas" w:cs="Consolas" w:eastAsia="Consolas" w:hAnsi="Consolas"/>
+          <w:color w:val="9AA0A6"/>
+          <w:sz w:val="14"/>
+          <w:szCs w:val="14"/>
+        </w:rPr>
         <w:t xml:space="preserve">AE-0225  </w:t>
       </w:r>
       <w:r>
@@ -6204,6 +6278,518 @@
           <w:sz w:val="22"/>
           <w:szCs w:val="22"/>
         </w:rPr>
+        <w:t xml:space="preserve">Brinquedo de apego e itens de distração</w:t>
+      </w:r>
+    </w:p>
+    <w:p>
+      <w:pPr>
+        <w:pStyle w:val="Heading2"/>
+        <w:spacing w:after="120" w:before="280"/>
+      </w:pPr>
+      <w:r>
+        <w:rPr>
+          <w:rFonts w:ascii="Consolas" w:cs="Consolas" w:eastAsia="Consolas" w:hAnsi="Consolas"/>
+          <w:color w:val="9AA0A6"/>
+          <w:sz w:val="14"/>
+          <w:szCs w:val="14"/>
+        </w:rPr>
+        <w:t xml:space="preserve">AE-0226  </w:t>
+      </w:r>
+      <w:r>
+        <w:rPr>
+          <w:b/>
+          <w:bCs/>
+          <w:sz w:val="26"/>
+          <w:szCs w:val="26"/>
+        </w:rPr>
+        <w:t xml:space="preserve">Módulo Acessibilidade e Apoio</w:t>
+      </w:r>
+    </w:p>
+    <w:p>
+      <w:pPr>
+        <w:spacing w:after="60" w:before="180"/>
+      </w:pPr>
+      <w:r>
+        <w:rPr>
+          <w:b/>
+          <w:bCs/>
+          <w:color w:val="9AA0A6"/>
+          <w:spacing w:val="20"/>
+          <w:sz w:val="16"/>
+          <w:szCs w:val="16"/>
+        </w:rPr>
+        <w:t xml:space="preserve">INTRODUCAO</w:t>
+      </w:r>
+    </w:p>
+    <w:p>
+      <w:pPr>
+        <w:spacing w:after="160" w:line="300"/>
+      </w:pPr>
+      <w:r>
+        <w:rPr>
+          <w:rFonts w:ascii="Consolas" w:cs="Consolas" w:eastAsia="Consolas" w:hAnsi="Consolas"/>
+          <w:color w:val="9AA0A6"/>
+          <w:sz w:val="14"/>
+          <w:szCs w:val="14"/>
+        </w:rPr>
+        <w:t xml:space="preserve">AE-0227  </w:t>
+      </w:r>
+      <w:r>
+        <w:rPr>
+          <w:sz w:val="22"/>
+          <w:szCs w:val="22"/>
+        </w:rPr>
+        <w:t xml:space="preserve">Facilitadores de locomoção e conforto.</w:t>
+      </w:r>
+    </w:p>
+    <w:p>
+      <w:pPr>
+        <w:spacing w:after="60" w:before="180"/>
+      </w:pPr>
+      <w:r>
+        <w:rPr>
+          <w:b/>
+          <w:bCs/>
+          <w:color w:val="9AA0A6"/>
+          <w:spacing w:val="20"/>
+          <w:sz w:val="16"/>
+          <w:szCs w:val="16"/>
+        </w:rPr>
+        <w:t xml:space="preserve">ITENS</w:t>
+      </w:r>
+    </w:p>
+    <w:p>
+      <w:pPr>
+        <w:spacing w:after="160" w:line="300"/>
+      </w:pPr>
+      <w:r>
+        <w:rPr>
+          <w:rFonts w:ascii="Consolas" w:cs="Consolas" w:eastAsia="Consolas" w:hAnsi="Consolas"/>
+          <w:color w:val="9AA0A6"/>
+          <w:sz w:val="14"/>
+          <w:szCs w:val="14"/>
+        </w:rPr>
+        <w:t xml:space="preserve">AE-0228  </w:t>
+      </w:r>
+      <w:r>
+        <w:rPr>
+          <w:sz w:val="22"/>
+          <w:szCs w:val="22"/>
+        </w:rPr>
+        <w:t xml:space="preserve">Bengala, andador ou cadeira de rodas revisados</w:t>
+      </w:r>
+    </w:p>
+    <w:p>
+      <w:pPr>
+        <w:spacing w:after="160" w:line="300"/>
+      </w:pPr>
+      <w:r>
+        <w:rPr>
+          <w:rFonts w:ascii="Consolas" w:cs="Consolas" w:eastAsia="Consolas" w:hAnsi="Consolas"/>
+          <w:color w:val="9AA0A6"/>
+          <w:sz w:val="14"/>
+          <w:szCs w:val="14"/>
+        </w:rPr>
+        <w:t xml:space="preserve">AE-0229  </w:t>
+      </w:r>
+      <w:r>
+        <w:rPr>
+          <w:sz w:val="22"/>
+          <w:szCs w:val="22"/>
+        </w:rPr>
+        <w:t xml:space="preserve">Laudos médicos, sobretudo para voo e cruzeiro</w:t>
+      </w:r>
+    </w:p>
+    <w:p>
+      <w:pPr>
+        <w:spacing w:after="160" w:line="300"/>
+      </w:pPr>
+      <w:r>
+        <w:rPr>
+          <w:rFonts w:ascii="Consolas" w:cs="Consolas" w:eastAsia="Consolas" w:hAnsi="Consolas"/>
+          <w:color w:val="9AA0A6"/>
+          <w:sz w:val="14"/>
+          <w:szCs w:val="14"/>
+        </w:rPr>
+        <w:t xml:space="preserve">AE-0230  </w:t>
+      </w:r>
+      <w:r>
+        <w:rPr>
+          <w:sz w:val="22"/>
+          <w:szCs w:val="22"/>
+        </w:rPr>
+        <w:t xml:space="preserve">Calçado muito confortável e antiderrapante</w:t>
+      </w:r>
+    </w:p>
+    <w:p>
+      <w:pPr>
+        <w:spacing w:after="160" w:line="300"/>
+      </w:pPr>
+      <w:r>
+        <w:rPr>
+          <w:rFonts w:ascii="Consolas" w:cs="Consolas" w:eastAsia="Consolas" w:hAnsi="Consolas"/>
+          <w:color w:val="9AA0A6"/>
+          <w:sz w:val="14"/>
+          <w:szCs w:val="14"/>
+        </w:rPr>
+        <w:t xml:space="preserve">AE-0231  </w:t>
+      </w:r>
+      <w:r>
+        <w:rPr>
+          <w:sz w:val="22"/>
+          <w:szCs w:val="22"/>
+        </w:rPr>
+        <w:t xml:space="preserve">Travesseiro de pescoço ergonômico</w:t>
+      </w:r>
+    </w:p>
+    <w:p>
+      <w:pPr>
+        <w:pStyle w:val="Heading2"/>
+        <w:spacing w:after="120" w:before="280"/>
+      </w:pPr>
+      <w:r>
+        <w:rPr>
+          <w:b/>
+          <w:bCs/>
+          <w:sz w:val="26"/>
+          <w:szCs w:val="26"/>
+        </w:rPr>
+        <w:t xml:space="preserve">Módulo Praia e Resort</w:t>
+      </w:r>
+    </w:p>
+    <w:p>
+      <w:pPr>
+        <w:spacing w:after="60" w:before="180"/>
+      </w:pPr>
+      <w:r>
+        <w:rPr>
+          <w:b/>
+          <w:bCs/>
+          <w:color w:val="9AA0A6"/>
+          <w:spacing w:val="20"/>
+          <w:sz w:val="16"/>
+          <w:szCs w:val="16"/>
+        </w:rPr>
+        <w:t xml:space="preserve">INTRODUCAO</w:t>
+      </w:r>
+    </w:p>
+    <w:p>
+      <w:pPr>
+        <w:spacing w:after="160" w:line="300"/>
+      </w:pPr>
+      <w:r>
+        <w:rPr>
+          <w:rFonts w:ascii="Consolas" w:cs="Consolas" w:eastAsia="Consolas" w:hAnsi="Consolas"/>
+          <w:color w:val="9AA0A6"/>
+          <w:sz w:val="14"/>
+          <w:szCs w:val="14"/>
+        </w:rPr>
+        <w:t xml:space="preserve">AE-0232  </w:t>
+      </w:r>
+      <w:r>
+        <w:rPr>
+          <w:sz w:val="22"/>
+          <w:szCs w:val="22"/>
+        </w:rPr>
+        <w:t xml:space="preserve">Cuidados essenciais sob o sol.</w:t>
+      </w:r>
+    </w:p>
+    <w:p>
+      <w:pPr>
+        <w:spacing w:after="60" w:before="180"/>
+      </w:pPr>
+      <w:r>
+        <w:rPr>
+          <w:b/>
+          <w:bCs/>
+          <w:color w:val="9AA0A6"/>
+          <w:spacing w:val="20"/>
+          <w:sz w:val="16"/>
+          <w:szCs w:val="16"/>
+        </w:rPr>
+        <w:t xml:space="preserve">ITENS</w:t>
+      </w:r>
+    </w:p>
+    <w:p>
+      <w:pPr>
+        <w:spacing w:after="160" w:line="300"/>
+      </w:pPr>
+      <w:r>
+        <w:rPr>
+          <w:rFonts w:ascii="Consolas" w:cs="Consolas" w:eastAsia="Consolas" w:hAnsi="Consolas"/>
+          <w:color w:val="9AA0A6"/>
+          <w:sz w:val="14"/>
+          <w:szCs w:val="14"/>
+        </w:rPr>
+        <w:t xml:space="preserve">AE-0233  </w:t>
+      </w:r>
+      <w:r>
+        <w:rPr>
+          <w:sz w:val="22"/>
+          <w:szCs w:val="22"/>
+        </w:rPr>
+        <w:t xml:space="preserve">Repelente resistente à água</w:t>
+      </w:r>
+    </w:p>
+    <w:p>
+      <w:pPr>
+        <w:spacing w:after="160" w:line="300"/>
+      </w:pPr>
+      <w:r>
+        <w:rPr>
+          <w:rFonts w:ascii="Consolas" w:cs="Consolas" w:eastAsia="Consolas" w:hAnsi="Consolas"/>
+          <w:color w:val="9AA0A6"/>
+          <w:sz w:val="14"/>
+          <w:szCs w:val="14"/>
+        </w:rPr>
+        <w:t xml:space="preserve">AE-0234  </w:t>
+      </w:r>
+      <w:r>
+        <w:rPr>
+          <w:sz w:val="22"/>
+          <w:szCs w:val="22"/>
+        </w:rPr>
+        <w:t xml:space="preserve">Boia de corpo ou colete salva-vidas infantil</w:t>
+      </w:r>
+    </w:p>
+    <w:p>
+      <w:pPr>
+        <w:spacing w:after="160" w:line="300"/>
+      </w:pPr>
+      <w:r>
+        <w:rPr>
+          <w:rFonts w:ascii="Consolas" w:cs="Consolas" w:eastAsia="Consolas" w:hAnsi="Consolas"/>
+          <w:color w:val="9AA0A6"/>
+          <w:sz w:val="14"/>
+          <w:szCs w:val="14"/>
+        </w:rPr>
+        <w:t xml:space="preserve">AE-0235  </w:t>
+      </w:r>
+      <w:r>
+        <w:rPr>
+          <w:sz w:val="22"/>
+          <w:szCs w:val="22"/>
+        </w:rPr>
+        <w:t xml:space="preserve">Saco estanque para proteger o celular da areia e da água</w:t>
+      </w:r>
+    </w:p>
+    <w:p>
+      <w:pPr>
+        <w:pStyle w:val="Heading2"/>
+        <w:spacing w:after="120" w:before="280"/>
+      </w:pPr>
+      <w:r>
+        <w:rPr>
+          <w:b/>
+          <w:bCs/>
+          <w:sz w:val="26"/>
+          <w:szCs w:val="26"/>
+        </w:rPr>
+        <w:t xml:space="preserve">Módulo Campo e Natureza</w:t>
+      </w:r>
+    </w:p>
+    <w:p>
+      <w:pPr>
+        <w:spacing w:after="60" w:before="180"/>
+      </w:pPr>
+      <w:r>
+        <w:rPr>
+          <w:b/>
+          <w:bCs/>
+          <w:color w:val="9AA0A6"/>
+          <w:spacing w:val="20"/>
+          <w:sz w:val="16"/>
+          <w:szCs w:val="16"/>
+        </w:rPr>
+        <w:t xml:space="preserve">INTRODUCAO</w:t>
+      </w:r>
+    </w:p>
+    <w:p>
+      <w:pPr>
+        <w:spacing w:after="160" w:line="300"/>
+      </w:pPr>
+      <w:r>
+        <w:rPr>
+          <w:rFonts w:ascii="Consolas" w:cs="Consolas" w:eastAsia="Consolas" w:hAnsi="Consolas"/>
+          <w:color w:val="9AA0A6"/>
+          <w:sz w:val="14"/>
+          <w:szCs w:val="14"/>
+        </w:rPr>
+        <w:t xml:space="preserve">AE-0236  </w:t>
+      </w:r>
+      <w:r>
+        <w:rPr>
+          <w:sz w:val="22"/>
+          <w:szCs w:val="22"/>
+        </w:rPr>
+        <w:t xml:space="preserve">Prevenção contra insetos e clima imprevisível.</w:t>
+      </w:r>
+    </w:p>
+    <w:p>
+      <w:pPr>
+        <w:spacing w:after="60" w:before="180"/>
+      </w:pPr>
+      <w:r>
+        <w:rPr>
+          <w:b/>
+          <w:bCs/>
+          <w:color w:val="9AA0A6"/>
+          <w:spacing w:val="20"/>
+          <w:sz w:val="16"/>
+          <w:szCs w:val="16"/>
+        </w:rPr>
+        <w:t xml:space="preserve">ITENS</w:t>
+      </w:r>
+    </w:p>
+    <w:p>
+      <w:pPr>
+        <w:spacing w:after="160" w:line="300"/>
+      </w:pPr>
+      <w:r>
+        <w:rPr>
+          <w:rFonts w:ascii="Consolas" w:cs="Consolas" w:eastAsia="Consolas" w:hAnsi="Consolas"/>
+          <w:color w:val="9AA0A6"/>
+          <w:sz w:val="14"/>
+          <w:szCs w:val="14"/>
+        </w:rPr>
+        <w:t xml:space="preserve">AE-0237  </w:t>
+      </w:r>
+      <w:r>
+        <w:rPr>
+          <w:sz w:val="22"/>
+          <w:szCs w:val="22"/>
+        </w:rPr>
+        <w:t xml:space="preserve">Repelente forte (icaridina) para carrapato e mosquito</w:t>
+      </w:r>
+    </w:p>
+    <w:p>
+      <w:pPr>
+        <w:spacing w:after="160" w:line="300"/>
+      </w:pPr>
+      <w:r>
+        <w:rPr>
+          <w:rFonts w:ascii="Consolas" w:cs="Consolas" w:eastAsia="Consolas" w:hAnsi="Consolas"/>
+          <w:color w:val="9AA0A6"/>
+          <w:sz w:val="14"/>
+          <w:szCs w:val="14"/>
+        </w:rPr>
+        <w:t xml:space="preserve">AE-0238  </w:t>
+      </w:r>
+      <w:r>
+        <w:rPr>
+          <w:sz w:val="22"/>
+          <w:szCs w:val="22"/>
+        </w:rPr>
+        <w:t xml:space="preserve">Bota ou calçado fechado, contra animais peçonhentos</w:t>
+      </w:r>
+    </w:p>
+    <w:p>
+      <w:pPr>
+        <w:spacing w:after="160" w:line="300"/>
+      </w:pPr>
+      <w:r>
+        <w:rPr>
+          <w:rFonts w:ascii="Consolas" w:cs="Consolas" w:eastAsia="Consolas" w:hAnsi="Consolas"/>
+          <w:color w:val="9AA0A6"/>
+          <w:sz w:val="14"/>
+          <w:szCs w:val="14"/>
+        </w:rPr>
+        <w:t xml:space="preserve">AE-0239  </w:t>
+      </w:r>
+      <w:r>
+        <w:rPr>
+          <w:sz w:val="22"/>
+          <w:szCs w:val="22"/>
+        </w:rPr>
+        <w:t xml:space="preserve">Lanterna de cabeça com pilhas extras</w:t>
+      </w:r>
+    </w:p>
+    <w:p>
+      <w:pPr>
+        <w:pStyle w:val="Heading2"/>
+        <w:spacing w:after="120" w:before="280"/>
+      </w:pPr>
+      <w:r>
+        <w:rPr>
+          <w:b/>
+          <w:bCs/>
+          <w:sz w:val="26"/>
+          <w:szCs w:val="26"/>
+        </w:rPr>
+        <w:t xml:space="preserve">Módulo Internacional</w:t>
+      </w:r>
+    </w:p>
+    <w:p>
+      <w:pPr>
+        <w:spacing w:after="60" w:before="180"/>
+      </w:pPr>
+      <w:r>
+        <w:rPr>
+          <w:b/>
+          <w:bCs/>
+          <w:color w:val="9AA0A6"/>
+          <w:spacing w:val="20"/>
+          <w:sz w:val="16"/>
+          <w:szCs w:val="16"/>
+        </w:rPr>
+        <w:t xml:space="preserve">INTRODUCAO</w:t>
+      </w:r>
+    </w:p>
+    <w:p>
+      <w:pPr>
+        <w:spacing w:after="160" w:line="300"/>
+      </w:pPr>
+      <w:r>
+        <w:rPr>
+          <w:rFonts w:ascii="Consolas" w:cs="Consolas" w:eastAsia="Consolas" w:hAnsi="Consolas"/>
+          <w:color w:val="9AA0A6"/>
+          <w:sz w:val="14"/>
+          <w:szCs w:val="14"/>
+        </w:rPr>
+        <w:t xml:space="preserve">AE-0240  </w:t>
+      </w:r>
+      <w:r>
+        <w:rPr>
+          <w:sz w:val="22"/>
+          <w:szCs w:val="22"/>
+        </w:rPr>
+        <w:t xml:space="preserve">Documentação e energia para outro país.</w:t>
+      </w:r>
+    </w:p>
+    <w:p>
+      <w:pPr>
+        <w:spacing w:after="60" w:before="180"/>
+      </w:pPr>
+      <w:r>
+        <w:rPr>
+          <w:b/>
+          <w:bCs/>
+          <w:color w:val="9AA0A6"/>
+          <w:spacing w:val="20"/>
+          <w:sz w:val="16"/>
+          <w:szCs w:val="16"/>
+        </w:rPr>
+        <w:t xml:space="preserve">ITENS</w:t>
+      </w:r>
+    </w:p>
+    <w:p>
+      <w:pPr>
+        <w:spacing w:after="160" w:line="300"/>
+      </w:pPr>
+      <w:r>
+        <w:rPr>
+          <w:rFonts w:ascii="Consolas" w:cs="Consolas" w:eastAsia="Consolas" w:hAnsi="Consolas"/>
+          <w:color w:val="9AA0A6"/>
+          <w:sz w:val="14"/>
+          <w:szCs w:val="14"/>
+        </w:rPr>
+        <w:t xml:space="preserve">AE-0241  </w:t>
+      </w:r>
+      <w:r>
+        <w:rPr>
+          <w:sz w:val="22"/>
+          <w:szCs w:val="22"/>
+        </w:rPr>
         <w:t xml:space="preserve">Adaptador universal de tomadas</w:t>
       </w:r>
     </w:p>
@@ -6218,7 +6804,7 @@
           <w:sz w:val="14"/>
           <w:szCs w:val="14"/>
         </w:rPr>
-        <w:t xml:space="preserve">AE-0226  </w:t>
+        <w:t xml:space="preserve">AE-0242  </w:t>
       </w:r>
       <w:r>
         <w:rPr>
@@ -6239,7 +6825,7 @@
           <w:sz w:val="14"/>
           <w:szCs w:val="14"/>
         </w:rPr>
-        <w:t xml:space="preserve">AE-0227  </w:t>
+        <w:t xml:space="preserve">AE-0243  </w:t>
       </w:r>
       <w:r>
         <w:rPr>
@@ -6260,7 +6846,7 @@
           <w:sz w:val="14"/>
           <w:szCs w:val="14"/>
         </w:rPr>
-        <w:t xml:space="preserve">AE-0228  </w:t>
+        <w:t xml:space="preserve">AE-0244  </w:t>
       </w:r>
       <w:r>
         <w:rPr>
@@ -6298,7 +6884,7 @@
           <w:sz w:val="14"/>
           <w:szCs w:val="14"/>
         </w:rPr>
-        <w:t xml:space="preserve">AE-0229  </w:t>
+        <w:t xml:space="preserve">AE-0245  </w:t>
       </w:r>
       <w:r>
         <w:rPr>
@@ -6319,7 +6905,7 @@
           <w:sz w:val="14"/>
           <w:szCs w:val="14"/>
         </w:rPr>
-        <w:t xml:space="preserve">AE-0230  </w:t>
+        <w:t xml:space="preserve">AE-0246  </w:t>
       </w:r>
       <w:r>
         <w:rPr>
@@ -6388,7 +6974,7 @@
           <w:sz w:val="14"/>
           <w:szCs w:val="14"/>
         </w:rPr>
-        <w:t xml:space="preserve">AE-0231  </w:t>
+        <w:t xml:space="preserve">AE-0247  </w:t>
       </w:r>
       <w:r>
         <w:rPr>
@@ -6457,7 +7043,7 @@
           <w:sz w:val="14"/>
           <w:szCs w:val="14"/>
         </w:rPr>
-        <w:t xml:space="preserve">AE-0232  </w:t>
+        <w:t xml:space="preserve">AE-0248  </w:t>
       </w:r>
       <w:r>
         <w:rPr>
@@ -6479,7 +7065,7 @@
           <w:sz w:val="14"/>
           <w:szCs w:val="14"/>
         </w:rPr>
-        <w:t xml:space="preserve">AE-0233  </w:t>
+        <w:t xml:space="preserve">AE-0249  </w:t>
       </w:r>
       <w:r>
         <w:rPr>
@@ -6533,7 +7119,7 @@
           <w:sz w:val="14"/>
           <w:szCs w:val="14"/>
         </w:rPr>
-        <w:t xml:space="preserve">AE-0234  </w:t>
+        <w:t xml:space="preserve">AE-0250  </w:t>
       </w:r>
       <w:r>
         <w:rPr>

</xml_diff>